<commit_message>
RM/SRD UC 식별자 변경, RTM SRD 기준 완성
</commit_message>
<xml_diff>
--- a/Document/SDLC/비즈니스모델(BM).docx
+++ b/Document/SDLC/비즈니스모델(BM).docx
@@ -240,7 +240,6 @@
           <w:szCs w:val="26"/>
         </w:rPr>
       </w:pPr>
-      <w:proofErr w:type="gramStart"/>
       <w:r>
         <w:rPr>
           <w:rFonts w:ascii="맑은 고딕" w:eastAsia="맑은 고딕" w:hAnsi="맑은 고딕" w:cs="맑은 고딕"/>
@@ -248,19 +247,8 @@
           <w:sz w:val="26"/>
           <w:szCs w:val="26"/>
         </w:rPr>
-        <w:t>[ 시스템명</w:t>
+        <w:t xml:space="preserve">[ 시스템명: </w:t>
       </w:r>
-      <w:proofErr w:type="gramEnd"/>
-      <w:r>
-        <w:rPr>
-          <w:rFonts w:ascii="맑은 고딕" w:eastAsia="맑은 고딕" w:hAnsi="맑은 고딕" w:cs="맑은 고딕"/>
-          <w:b/>
-          <w:sz w:val="26"/>
-          <w:szCs w:val="26"/>
-        </w:rPr>
-        <w:t xml:space="preserve">: </w:t>
-      </w:r>
-      <w:proofErr w:type="spellStart"/>
       <w:r>
         <w:rPr>
           <w:rFonts w:ascii="맑은 고딕" w:eastAsia="맑은 고딕" w:hAnsi="맑은 고딕" w:cs="맑은 고딕" w:hint="eastAsia"/>
@@ -269,29 +257,7 @@
           <w:sz w:val="26"/>
           <w:szCs w:val="26"/>
         </w:rPr>
-        <w:t>플래시톡</w:t>
-      </w:r>
-      <w:proofErr w:type="spellEnd"/>
-      <w:r>
-        <w:rPr>
-          <w:rFonts w:ascii="맑은 고딕" w:eastAsia="맑은 고딕" w:hAnsi="맑은 고딕" w:cs="맑은 고딕" w:hint="eastAsia"/>
-          <w:b/>
-          <w:color w:val="0000FF"/>
-          <w:sz w:val="26"/>
-          <w:szCs w:val="26"/>
-        </w:rPr>
-        <w:t xml:space="preserve"> </w:t>
-      </w:r>
-      <w:proofErr w:type="gramStart"/>
-      <w:r>
-        <w:rPr>
-          <w:rFonts w:ascii="맑은 고딕" w:eastAsia="맑은 고딕" w:hAnsi="맑은 고딕" w:cs="맑은 고딕" w:hint="eastAsia"/>
-          <w:b/>
-          <w:color w:val="0000FF"/>
-          <w:sz w:val="26"/>
-          <w:szCs w:val="26"/>
-        </w:rPr>
-        <w:t>시</w:t>
+        <w:t>플래시톡 시</w:t>
       </w:r>
       <w:r>
         <w:rPr>
@@ -312,7 +278,6 @@
         </w:rPr>
         <w:t>]</w:t>
       </w:r>
-      <w:proofErr w:type="gramEnd"/>
     </w:p>
     <w:p>
       <w:pPr>
@@ -698,7 +663,7 @@
           <w:sz w:val="32"/>
           <w:szCs w:val="32"/>
         </w:rPr>
-        <w:t>4</w:t>
+        <w:t>5</w:t>
       </w:r>
       <w:r>
         <w:rPr>
@@ -967,7 +932,6 @@
                 <w:szCs w:val="26"/>
               </w:rPr>
             </w:pPr>
-            <w:proofErr w:type="spellStart"/>
             <w:r>
               <w:rPr>
                 <w:rFonts w:ascii="맑은 고딕" w:eastAsia="맑은 고딕" w:hAnsi="맑은 고딕" w:cs="맑은 고딕" w:hint="eastAsia"/>
@@ -978,7 +942,6 @@
               </w:rPr>
               <w:t>말모이</w:t>
             </w:r>
-            <w:proofErr w:type="spellEnd"/>
           </w:p>
         </w:tc>
       </w:tr>
@@ -1122,20 +1085,8 @@
                 <w:sz w:val="26"/>
                 <w:szCs w:val="26"/>
               </w:rPr>
-              <w:t xml:space="preserve">2633610 </w:t>
-            </w:r>
-            <w:proofErr w:type="spellStart"/>
-            <w:r>
-              <w:rPr>
-                <w:rFonts w:ascii="맑은 고딕" w:eastAsia="맑은 고딕" w:hAnsi="맑은 고딕" w:cs="맑은 고딕" w:hint="eastAsia"/>
-                <w:b/>
-                <w:color w:val="000000"/>
-                <w:sz w:val="26"/>
-                <w:szCs w:val="26"/>
-              </w:rPr>
-              <w:t>임효진</w:t>
-            </w:r>
-            <w:proofErr w:type="spellEnd"/>
+              <w:t>2633610 임효진</w:t>
+            </w:r>
           </w:p>
         </w:tc>
       </w:tr>
@@ -1211,16 +1162,16 @@
         <mc:AlternateContent>
           <mc:Choice Requires="wps">
             <w:drawing>
-              <wp:anchor distT="0" distB="0" distL="0" distR="0" simplePos="0" relativeHeight="251662336" behindDoc="1" locked="0" layoutInCell="1" hidden="0" allowOverlap="1" wp14:anchorId="3468A5BF" wp14:editId="2DAB7312">
+              <wp:anchor distT="0" distB="0" distL="0" distR="0" simplePos="0" relativeHeight="251662336" behindDoc="1" locked="0" layoutInCell="1" hidden="0" allowOverlap="1" wp14:anchorId="3468A5BF" wp14:editId="1160F85F">
                 <wp:simplePos x="0" y="0"/>
                 <wp:positionH relativeFrom="page">
-                  <wp:posOffset>922657</wp:posOffset>
+                  <wp:posOffset>907415</wp:posOffset>
                 </wp:positionH>
-                <wp:positionV relativeFrom="page">
-                  <wp:posOffset>1170307</wp:posOffset>
+                <wp:positionV relativeFrom="margin">
+                  <wp:align>center</wp:align>
                 </wp:positionV>
                 <wp:extent cx="5762625" cy="8515350"/>
-                <wp:effectExtent l="0" t="0" r="0" b="0"/>
+                <wp:effectExtent l="0" t="0" r="28575" b="19050"/>
                 <wp:wrapNone/>
                 <wp:docPr id="2095518422" name="자유형: 도형 2095518422"/>
                 <wp:cNvGraphicFramePr/>
@@ -1230,8 +1181,8 @@
                       <wps:cNvSpPr/>
                       <wps:spPr>
                         <a:xfrm>
-                          <a:off x="2483738" y="0"/>
-                          <a:ext cx="5724525" cy="7560000"/>
+                          <a:off x="0" y="0"/>
+                          <a:ext cx="5762625" cy="8515350"/>
                         </a:xfrm>
                         <a:custGeom>
                           <a:avLst/>
@@ -1328,10 +1279,10 @@
           </mc:Choice>
           <mc:Fallback>
             <w:pict>
-              <v:shape w14:anchorId="07F2FCF7" id="자유형: 도형 2095518422" o:spid="_x0000_s1026" style="position:absolute;margin-left:72.65pt;margin-top:92.15pt;width:453.75pt;height:670.5pt;z-index:-251654144;visibility:visible;mso-wrap-style:square;mso-wrap-distance-left:0;mso-wrap-distance-top:0;mso-wrap-distance-right:0;mso-wrap-distance-bottom:0;mso-position-horizontal:absolute;mso-position-horizontal-relative:page;mso-position-vertical:absolute;mso-position-vertical-relative:page;v-text-anchor:middle" coordsize="5724525,8477250" o:gfxdata="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" path="m1523,r,8477198em5721070,r,8477198em,l5724118,em,8477198r5724118,em5721070,r,8477198em1523,r,8477198em,8477198r5724118,em,l5724118,e" filled="f">
+              <v:shape w14:anchorId="303DBD40" id="자유형: 도형 2095518422" o:spid="_x0000_s1026" style="position:absolute;margin-left:71.45pt;margin-top:0;width:453.75pt;height:670.5pt;z-index:-251654144;visibility:visible;mso-wrap-style:square;mso-wrap-distance-left:0;mso-wrap-distance-top:0;mso-wrap-distance-right:0;mso-wrap-distance-bottom:0;mso-position-horizontal:absolute;mso-position-horizontal-relative:page;mso-position-vertical:center;mso-position-vertical-relative:margin;v-text-anchor:middle" coordsize="5724525,8477250" o:gfxdata="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" path="m1523,r,8477198em5721070,r,8477198em,l5724118,em,8477198r5724118,em5721070,r,8477198em1523,r,8477198em,8477198r5724118,em,l5724118,e" filled="f">
                 <v:stroke startarrowwidth="narrow" startarrowlength="short" endarrowwidth="narrow" endarrowlength="short"/>
                 <v:path arrowok="t" o:extrusionok="f"/>
-                <w10:wrap anchorx="page" anchory="page"/>
+                <w10:wrap anchorx="page" anchory="margin"/>
               </v:shape>
             </w:pict>
           </mc:Fallback>
@@ -1366,21 +1317,8 @@
           <w:szCs w:val="32"/>
           <w:u w:val="single"/>
         </w:rPr>
-        <w:t xml:space="preserve">문서 제/개정 </w:t>
+        <w:t>문서 제/개정 이력표</w:t>
       </w:r>
-      <w:proofErr w:type="spellStart"/>
-      <w:r>
-        <w:rPr>
-          <w:rFonts w:ascii="맑은 고딕" w:eastAsia="맑은 고딕" w:hAnsi="맑은 고딕" w:cs="맑은 고딕"/>
-          <w:b/>
-          <w:color w:val="000000"/>
-          <w:sz w:val="32"/>
-          <w:szCs w:val="32"/>
-          <w:u w:val="single"/>
-        </w:rPr>
-        <w:t>이력표</w:t>
-      </w:r>
-      <w:proofErr w:type="spellEnd"/>
     </w:p>
     <w:p>
       <w:pPr>
@@ -3172,121 +3110,6 @@
         <w:tc>
           <w:tcPr>
             <w:tcW w:w="510" w:type="dxa"/>
-          </w:tcPr>
-          <w:p>
-            <w:pPr>
-              <w:pBdr>
-                <w:top w:val="nil"/>
-                <w:left w:val="nil"/>
-                <w:bottom w:val="nil"/>
-                <w:right w:val="nil"/>
-                <w:between w:val="nil"/>
-              </w:pBdr>
-              <w:rPr>
-                <w:rFonts w:ascii="맑은 고딕" w:eastAsia="맑은 고딕" w:hAnsi="맑은 고딕" w:cs="맑은 고딕"/>
-                <w:color w:val="000000"/>
-                <w:sz w:val="18"/>
-                <w:szCs w:val="18"/>
-              </w:rPr>
-            </w:pPr>
-          </w:p>
-        </w:tc>
-        <w:tc>
-          <w:tcPr>
-            <w:tcW w:w="1260" w:type="dxa"/>
-          </w:tcPr>
-          <w:p>
-            <w:pPr>
-              <w:pBdr>
-                <w:top w:val="nil"/>
-                <w:left w:val="nil"/>
-                <w:bottom w:val="nil"/>
-                <w:right w:val="nil"/>
-                <w:between w:val="nil"/>
-              </w:pBdr>
-              <w:rPr>
-                <w:rFonts w:ascii="맑은 고딕" w:eastAsia="맑은 고딕" w:hAnsi="맑은 고딕" w:cs="맑은 고딕"/>
-                <w:color w:val="000000"/>
-                <w:sz w:val="18"/>
-                <w:szCs w:val="18"/>
-              </w:rPr>
-            </w:pPr>
-          </w:p>
-        </w:tc>
-        <w:tc>
-          <w:tcPr>
-            <w:tcW w:w="1560" w:type="dxa"/>
-          </w:tcPr>
-          <w:p>
-            <w:pPr>
-              <w:pBdr>
-                <w:top w:val="nil"/>
-                <w:left w:val="nil"/>
-                <w:bottom w:val="nil"/>
-                <w:right w:val="nil"/>
-                <w:between w:val="nil"/>
-              </w:pBdr>
-              <w:rPr>
-                <w:rFonts w:ascii="맑은 고딕" w:eastAsia="맑은 고딕" w:hAnsi="맑은 고딕" w:cs="맑은 고딕"/>
-                <w:color w:val="000000"/>
-                <w:sz w:val="18"/>
-                <w:szCs w:val="18"/>
-              </w:rPr>
-            </w:pPr>
-          </w:p>
-        </w:tc>
-        <w:tc>
-          <w:tcPr>
-            <w:tcW w:w="3211" w:type="dxa"/>
-          </w:tcPr>
-          <w:p>
-            <w:pPr>
-              <w:pBdr>
-                <w:top w:val="nil"/>
-                <w:left w:val="nil"/>
-                <w:bottom w:val="nil"/>
-                <w:right w:val="nil"/>
-                <w:between w:val="nil"/>
-              </w:pBdr>
-              <w:rPr>
-                <w:rFonts w:ascii="맑은 고딕" w:eastAsia="맑은 고딕" w:hAnsi="맑은 고딕" w:cs="맑은 고딕"/>
-                <w:color w:val="000000"/>
-                <w:sz w:val="18"/>
-                <w:szCs w:val="18"/>
-              </w:rPr>
-            </w:pPr>
-          </w:p>
-        </w:tc>
-        <w:tc>
-          <w:tcPr>
-            <w:tcW w:w="2009" w:type="dxa"/>
-          </w:tcPr>
-          <w:p>
-            <w:pPr>
-              <w:pBdr>
-                <w:top w:val="nil"/>
-                <w:left w:val="nil"/>
-                <w:bottom w:val="nil"/>
-                <w:right w:val="nil"/>
-                <w:between w:val="nil"/>
-              </w:pBdr>
-              <w:rPr>
-                <w:rFonts w:ascii="맑은 고딕" w:eastAsia="맑은 고딕" w:hAnsi="맑은 고딕" w:cs="맑은 고딕"/>
-                <w:color w:val="000000"/>
-                <w:sz w:val="18"/>
-                <w:szCs w:val="18"/>
-              </w:rPr>
-            </w:pPr>
-          </w:p>
-        </w:tc>
-      </w:tr>
-      <w:tr>
-        <w:trPr>
-          <w:trHeight w:val="452"/>
-        </w:trPr>
-        <w:tc>
-          <w:tcPr>
-            <w:tcW w:w="510" w:type="dxa"/>
             <w:vAlign w:val="center"/>
           </w:tcPr>
           <w:p>
@@ -3302,8 +3125,8 @@
               <w:rPr>
                 <w:rFonts w:ascii="맑은 고딕" w:eastAsia="맑은 고딕" w:hAnsi="맑은 고딕" w:cs="맑은 고딕"/>
                 <w:color w:val="000000"/>
-                <w:sz w:val="20"/>
-                <w:szCs w:val="20"/>
+                <w:sz w:val="18"/>
+                <w:szCs w:val="18"/>
               </w:rPr>
             </w:pPr>
             <w:r>
@@ -3313,7 +3136,16 @@
                 <w:sz w:val="20"/>
                 <w:szCs w:val="20"/>
               </w:rPr>
-              <w:t>0.4</w:t>
+              <w:t>0.</w:t>
+            </w:r>
+            <w:r>
+              <w:rPr>
+                <w:rFonts w:ascii="맑은 고딕" w:eastAsia="맑은 고딕" w:hAnsi="맑은 고딕" w:cs="맑은 고딕" w:hint="eastAsia"/>
+                <w:color w:val="000000"/>
+                <w:sz w:val="20"/>
+                <w:szCs w:val="20"/>
+              </w:rPr>
+              <w:t>5</w:t>
             </w:r>
           </w:p>
         </w:tc>
@@ -3335,8 +3167,8 @@
               <w:rPr>
                 <w:rFonts w:ascii="맑은 고딕" w:eastAsia="맑은 고딕" w:hAnsi="맑은 고딕" w:cs="맑은 고딕"/>
                 <w:color w:val="000000"/>
-                <w:sz w:val="20"/>
-                <w:szCs w:val="20"/>
+                <w:sz w:val="18"/>
+                <w:szCs w:val="18"/>
               </w:rPr>
             </w:pPr>
             <w:r>
@@ -3346,7 +3178,16 @@
                 <w:sz w:val="20"/>
                 <w:szCs w:val="20"/>
               </w:rPr>
-              <w:t>2026. 04. 14</w:t>
+              <w:t>2026. 04. 1</w:t>
+            </w:r>
+            <w:r>
+              <w:rPr>
+                <w:rFonts w:ascii="맑은 고딕" w:eastAsia="맑은 고딕" w:hAnsi="맑은 고딕" w:cs="맑은 고딕" w:hint="eastAsia"/>
+                <w:color w:val="000000"/>
+                <w:sz w:val="20"/>
+                <w:szCs w:val="20"/>
+              </w:rPr>
+              <w:t>5</w:t>
             </w:r>
           </w:p>
         </w:tc>
@@ -3368,11 +3209,10 @@
               <w:rPr>
                 <w:rFonts w:ascii="맑은 고딕" w:eastAsia="맑은 고딕" w:hAnsi="맑은 고딕" w:cs="맑은 고딕"/>
                 <w:color w:val="000000"/>
-                <w:sz w:val="20"/>
-                <w:szCs w:val="20"/>
-              </w:rPr>
-            </w:pPr>
-            <w:proofErr w:type="spellStart"/>
+                <w:sz w:val="18"/>
+                <w:szCs w:val="18"/>
+              </w:rPr>
+            </w:pPr>
             <w:r>
               <w:rPr>
                 <w:rFonts w:ascii="맑은 고딕" w:eastAsia="맑은 고딕" w:hAnsi="맑은 고딕" w:cs="맑은 고딕" w:hint="eastAsia"/>
@@ -3380,9 +3220,8 @@
                 <w:sz w:val="20"/>
                 <w:szCs w:val="20"/>
               </w:rPr>
-              <w:t>임효진</w:t>
-            </w:r>
-            <w:proofErr w:type="spellEnd"/>
+              <w:t>김민성</w:t>
+            </w:r>
           </w:p>
         </w:tc>
         <w:tc>
@@ -3403,8 +3242,8 @@
               <w:rPr>
                 <w:rFonts w:ascii="맑은 고딕" w:eastAsia="맑은 고딕" w:hAnsi="맑은 고딕" w:cs="맑은 고딕"/>
                 <w:color w:val="000000"/>
-                <w:sz w:val="20"/>
-                <w:szCs w:val="20"/>
+                <w:sz w:val="18"/>
+                <w:szCs w:val="18"/>
               </w:rPr>
             </w:pPr>
             <w:r>
@@ -3414,27 +3253,7 @@
                 <w:sz w:val="20"/>
                 <w:szCs w:val="20"/>
               </w:rPr>
-              <w:t xml:space="preserve">비즈니스 </w:t>
-            </w:r>
-            <w:proofErr w:type="spellStart"/>
-            <w:r>
-              <w:rPr>
-                <w:rFonts w:ascii="맑은 고딕" w:eastAsia="맑은 고딕" w:hAnsi="맑은 고딕" w:cs="맑은 고딕" w:hint="eastAsia"/>
-                <w:color w:val="000000"/>
-                <w:sz w:val="20"/>
-                <w:szCs w:val="20"/>
-              </w:rPr>
-              <w:t>유스케이스</w:t>
-            </w:r>
-            <w:proofErr w:type="spellEnd"/>
-            <w:r>
-              <w:rPr>
-                <w:rFonts w:ascii="맑은 고딕" w:eastAsia="맑은 고딕" w:hAnsi="맑은 고딕" w:cs="맑은 고딕" w:hint="eastAsia"/>
-                <w:color w:val="000000"/>
-                <w:sz w:val="20"/>
-                <w:szCs w:val="20"/>
-              </w:rPr>
-              <w:t xml:space="preserve"> 목록 수정/활동 다이어그램 추가/객체 다이어그램 및 목록 수정</w:t>
+              <w:t>활동 다이어그램 식별자 부여</w:t>
             </w:r>
           </w:p>
         </w:tc>
@@ -3456,8 +3275,8 @@
               <w:rPr>
                 <w:rFonts w:ascii="맑은 고딕" w:eastAsia="맑은 고딕" w:hAnsi="맑은 고딕" w:cs="맑은 고딕"/>
                 <w:color w:val="000000"/>
-                <w:sz w:val="20"/>
-                <w:szCs w:val="20"/>
+                <w:sz w:val="18"/>
+                <w:szCs w:val="18"/>
               </w:rPr>
             </w:pPr>
             <w:r>
@@ -3505,7 +3324,7 @@
                 <w:sz w:val="20"/>
                 <w:szCs w:val="20"/>
               </w:rPr>
-              <w:t>0.3</w:t>
+              <w:t>0.4</w:t>
             </w:r>
           </w:p>
         </w:tc>
@@ -3538,7 +3357,7 @@
                 <w:sz w:val="20"/>
                 <w:szCs w:val="20"/>
               </w:rPr>
-              <w:t>2026. 04. 13</w:t>
+              <w:t>2026. 04. 14</w:t>
             </w:r>
           </w:p>
         </w:tc>
@@ -3571,7 +3390,7 @@
                 <w:sz w:val="20"/>
                 <w:szCs w:val="20"/>
               </w:rPr>
-              <w:t>김민성</w:t>
+              <w:t>임효진</w:t>
             </w:r>
           </w:p>
         </w:tc>
@@ -3604,27 +3423,7 @@
                 <w:sz w:val="20"/>
                 <w:szCs w:val="20"/>
               </w:rPr>
-              <w:t xml:space="preserve">비즈니스 </w:t>
-            </w:r>
-            <w:proofErr w:type="spellStart"/>
-            <w:r>
-              <w:rPr>
-                <w:rFonts w:ascii="맑은 고딕" w:eastAsia="맑은 고딕" w:hAnsi="맑은 고딕" w:cs="맑은 고딕" w:hint="eastAsia"/>
-                <w:color w:val="000000"/>
-                <w:sz w:val="20"/>
-                <w:szCs w:val="20"/>
-              </w:rPr>
-              <w:t>유스케이스</w:t>
-            </w:r>
-            <w:proofErr w:type="spellEnd"/>
-            <w:r>
-              <w:rPr>
-                <w:rFonts w:ascii="맑은 고딕" w:eastAsia="맑은 고딕" w:hAnsi="맑은 고딕" w:cs="맑은 고딕" w:hint="eastAsia"/>
-                <w:color w:val="000000"/>
-                <w:sz w:val="20"/>
-                <w:szCs w:val="20"/>
-              </w:rPr>
-              <w:t xml:space="preserve"> 시나리오 수정</w:t>
+              <w:t>비즈니스 유스케이스 목록 수정/활동 다이어그램 추가/객체 다이어그램 및 목록 수정</w:t>
             </w:r>
           </w:p>
         </w:tc>
@@ -3664,7 +3463,7 @@
       </w:tr>
       <w:tr>
         <w:trPr>
-          <w:trHeight w:val="454"/>
+          <w:trHeight w:val="452"/>
         </w:trPr>
         <w:tc>
           <w:tcPr>
@@ -3695,7 +3494,7 @@
                 <w:sz w:val="20"/>
                 <w:szCs w:val="20"/>
               </w:rPr>
-              <w:t>0.2</w:t>
+              <w:t>0.3</w:t>
             </w:r>
           </w:p>
         </w:tc>
@@ -3728,7 +3527,7 @@
                 <w:sz w:val="20"/>
                 <w:szCs w:val="20"/>
               </w:rPr>
-              <w:t>2026. 04. 11</w:t>
+              <w:t>2026. 04. 13</w:t>
             </w:r>
           </w:p>
         </w:tc>
@@ -3754,7 +3553,6 @@
                 <w:szCs w:val="20"/>
               </w:rPr>
             </w:pPr>
-            <w:proofErr w:type="spellStart"/>
             <w:r>
               <w:rPr>
                 <w:rFonts w:ascii="맑은 고딕" w:eastAsia="맑은 고딕" w:hAnsi="맑은 고딕" w:cs="맑은 고딕" w:hint="eastAsia"/>
@@ -3762,9 +3560,8 @@
                 <w:sz w:val="20"/>
                 <w:szCs w:val="20"/>
               </w:rPr>
-              <w:t>임효진</w:t>
-            </w:r>
-            <w:proofErr w:type="spellEnd"/>
+              <w:t>김민성</w:t>
+            </w:r>
           </w:p>
         </w:tc>
         <w:tc>
@@ -3796,36 +3593,7 @@
                 <w:sz w:val="20"/>
                 <w:szCs w:val="20"/>
               </w:rPr>
-              <w:t>BM 문서 수정</w:t>
-            </w:r>
-            <w:r>
-              <w:rPr>
-                <w:rFonts w:ascii="맑은 고딕" w:eastAsia="맑은 고딕" w:hAnsi="맑은 고딕" w:cs="맑은 고딕" w:hint="eastAsia"/>
-                <w:color w:val="000000"/>
-                <w:sz w:val="20"/>
-                <w:szCs w:val="20"/>
-              </w:rPr>
-              <w:t xml:space="preserve">(비즈니스 </w:t>
-            </w:r>
-            <w:proofErr w:type="spellStart"/>
-            <w:r>
-              <w:rPr>
-                <w:rFonts w:ascii="맑은 고딕" w:eastAsia="맑은 고딕" w:hAnsi="맑은 고딕" w:cs="맑은 고딕" w:hint="eastAsia"/>
-                <w:color w:val="000000"/>
-                <w:sz w:val="20"/>
-                <w:szCs w:val="20"/>
-              </w:rPr>
-              <w:t>유스케이스</w:t>
-            </w:r>
-            <w:proofErr w:type="spellEnd"/>
-            <w:r>
-              <w:rPr>
-                <w:rFonts w:ascii="맑은 고딕" w:eastAsia="맑은 고딕" w:hAnsi="맑은 고딕" w:cs="맑은 고딕" w:hint="eastAsia"/>
-                <w:color w:val="000000"/>
-                <w:sz w:val="20"/>
-                <w:szCs w:val="20"/>
-              </w:rPr>
-              <w:t xml:space="preserve"> 다이어그램, 목록)</w:t>
+              <w:t>비즈니스 유스케이스 시나리오 수정</w:t>
             </w:r>
           </w:p>
         </w:tc>
@@ -3865,7 +3633,7 @@
       </w:tr>
       <w:tr>
         <w:trPr>
-          <w:trHeight w:val="60"/>
+          <w:trHeight w:val="454"/>
         </w:trPr>
         <w:tc>
           <w:tcPr>
@@ -3891,12 +3659,12 @@
             </w:pPr>
             <w:r>
               <w:rPr>
-                <w:rFonts w:ascii="맑은 고딕" w:eastAsia="맑은 고딕" w:hAnsi="맑은 고딕" w:cs="맑은 고딕"/>
+                <w:rFonts w:ascii="맑은 고딕" w:eastAsia="맑은 고딕" w:hAnsi="맑은 고딕" w:cs="맑은 고딕" w:hint="eastAsia"/>
                 <w:color w:val="000000"/>
                 <w:sz w:val="20"/>
                 <w:szCs w:val="20"/>
               </w:rPr>
-              <w:t>0.1</w:t>
+              <w:t>0.2</w:t>
             </w:r>
           </w:p>
         </w:tc>
@@ -3924,57 +3692,12 @@
             </w:pPr>
             <w:r>
               <w:rPr>
-                <w:rFonts w:ascii="맑은 고딕" w:eastAsia="맑은 고딕" w:hAnsi="맑은 고딕" w:cs="맑은 고딕"/>
-                <w:color w:val="000000"/>
-                <w:sz w:val="20"/>
-                <w:szCs w:val="20"/>
-              </w:rPr>
-              <w:t>202</w:t>
-            </w:r>
-            <w:r>
-              <w:rPr>
                 <w:rFonts w:ascii="맑은 고딕" w:eastAsia="맑은 고딕" w:hAnsi="맑은 고딕" w:cs="맑은 고딕" w:hint="eastAsia"/>
                 <w:color w:val="000000"/>
                 <w:sz w:val="20"/>
                 <w:szCs w:val="20"/>
               </w:rPr>
-              <w:t>6</w:t>
-            </w:r>
-            <w:r>
-              <w:rPr>
-                <w:rFonts w:ascii="맑은 고딕" w:eastAsia="맑은 고딕" w:hAnsi="맑은 고딕" w:cs="맑은 고딕"/>
-                <w:color w:val="000000"/>
-                <w:sz w:val="20"/>
-                <w:szCs w:val="20"/>
-              </w:rPr>
-              <w:t>. 0</w:t>
-            </w:r>
-            <w:r>
-              <w:rPr>
-                <w:rFonts w:ascii="맑은 고딕" w:eastAsia="맑은 고딕" w:hAnsi="맑은 고딕" w:cs="맑은 고딕" w:hint="eastAsia"/>
-                <w:color w:val="000000"/>
-                <w:sz w:val="20"/>
-                <w:szCs w:val="20"/>
-              </w:rPr>
-              <w:t>4</w:t>
-            </w:r>
-            <w:r>
-              <w:rPr>
-                <w:rFonts w:ascii="맑은 고딕" w:eastAsia="맑은 고딕" w:hAnsi="맑은 고딕" w:cs="맑은 고딕"/>
-                <w:color w:val="000000"/>
-                <w:sz w:val="20"/>
-                <w:szCs w:val="20"/>
-              </w:rPr>
-              <w:t xml:space="preserve">. </w:t>
-            </w:r>
-            <w:r>
-              <w:rPr>
-                <w:rFonts w:ascii="맑은 고딕" w:eastAsia="맑은 고딕" w:hAnsi="맑은 고딕" w:cs="맑은 고딕" w:hint="eastAsia"/>
-                <w:color w:val="000000"/>
-                <w:sz w:val="20"/>
-                <w:szCs w:val="20"/>
-              </w:rPr>
-              <w:t>09</w:t>
+              <w:t>2026. 04. 11</w:t>
             </w:r>
           </w:p>
         </w:tc>
@@ -4000,7 +3723,6 @@
                 <w:szCs w:val="20"/>
               </w:rPr>
             </w:pPr>
-            <w:proofErr w:type="spellStart"/>
             <w:r>
               <w:rPr>
                 <w:rFonts w:ascii="맑은 고딕" w:eastAsia="맑은 고딕" w:hAnsi="맑은 고딕" w:cs="맑은 고딕" w:hint="eastAsia"/>
@@ -4010,7 +3732,230 @@
               </w:rPr>
               <w:t>임효진</w:t>
             </w:r>
-            <w:proofErr w:type="spellEnd"/>
+          </w:p>
+        </w:tc>
+        <w:tc>
+          <w:tcPr>
+            <w:tcW w:w="3211" w:type="dxa"/>
+            <w:vAlign w:val="center"/>
+          </w:tcPr>
+          <w:p>
+            <w:pPr>
+              <w:pBdr>
+                <w:top w:val="nil"/>
+                <w:left w:val="nil"/>
+                <w:bottom w:val="nil"/>
+                <w:right w:val="nil"/>
+                <w:between w:val="nil"/>
+              </w:pBdr>
+              <w:jc w:val="center"/>
+              <w:rPr>
+                <w:rFonts w:ascii="맑은 고딕" w:eastAsia="맑은 고딕" w:hAnsi="맑은 고딕" w:cs="맑은 고딕"/>
+                <w:color w:val="000000"/>
+                <w:sz w:val="20"/>
+                <w:szCs w:val="20"/>
+              </w:rPr>
+            </w:pPr>
+            <w:r>
+              <w:rPr>
+                <w:rFonts w:ascii="맑은 고딕" w:eastAsia="맑은 고딕" w:hAnsi="맑은 고딕" w:cs="맑은 고딕" w:hint="eastAsia"/>
+                <w:color w:val="000000"/>
+                <w:sz w:val="20"/>
+                <w:szCs w:val="20"/>
+              </w:rPr>
+              <w:t>BM 문서 수정</w:t>
+            </w:r>
+            <w:r>
+              <w:rPr>
+                <w:rFonts w:ascii="맑은 고딕" w:eastAsia="맑은 고딕" w:hAnsi="맑은 고딕" w:cs="맑은 고딕" w:hint="eastAsia"/>
+                <w:color w:val="000000"/>
+                <w:sz w:val="20"/>
+                <w:szCs w:val="20"/>
+              </w:rPr>
+              <w:t>(비즈니스 유스케이스 다이어그램, 목록)</w:t>
+            </w:r>
+          </w:p>
+        </w:tc>
+        <w:tc>
+          <w:tcPr>
+            <w:tcW w:w="2009" w:type="dxa"/>
+            <w:vAlign w:val="center"/>
+          </w:tcPr>
+          <w:p>
+            <w:pPr>
+              <w:pBdr>
+                <w:top w:val="nil"/>
+                <w:left w:val="nil"/>
+                <w:bottom w:val="nil"/>
+                <w:right w:val="nil"/>
+                <w:between w:val="nil"/>
+              </w:pBdr>
+              <w:jc w:val="center"/>
+              <w:rPr>
+                <w:rFonts w:ascii="맑은 고딕" w:eastAsia="맑은 고딕" w:hAnsi="맑은 고딕" w:cs="맑은 고딕"/>
+                <w:color w:val="000000"/>
+                <w:sz w:val="20"/>
+                <w:szCs w:val="20"/>
+              </w:rPr>
+            </w:pPr>
+            <w:r>
+              <w:rPr>
+                <w:rFonts w:ascii="맑은 고딕" w:eastAsia="맑은 고딕" w:hAnsi="맑은 고딕" w:cs="맑은 고딕" w:hint="eastAsia"/>
+                <w:color w:val="000000"/>
+                <w:sz w:val="20"/>
+                <w:szCs w:val="20"/>
+              </w:rPr>
+              <w:t>고객 대표 서명(인)</w:t>
+            </w:r>
+          </w:p>
+        </w:tc>
+      </w:tr>
+      <w:tr>
+        <w:trPr>
+          <w:trHeight w:val="60"/>
+        </w:trPr>
+        <w:tc>
+          <w:tcPr>
+            <w:tcW w:w="510" w:type="dxa"/>
+            <w:vAlign w:val="center"/>
+          </w:tcPr>
+          <w:p>
+            <w:pPr>
+              <w:pBdr>
+                <w:top w:val="nil"/>
+                <w:left w:val="nil"/>
+                <w:bottom w:val="nil"/>
+                <w:right w:val="nil"/>
+                <w:between w:val="nil"/>
+              </w:pBdr>
+              <w:jc w:val="center"/>
+              <w:rPr>
+                <w:rFonts w:ascii="맑은 고딕" w:eastAsia="맑은 고딕" w:hAnsi="맑은 고딕" w:cs="맑은 고딕"/>
+                <w:color w:val="000000"/>
+                <w:sz w:val="20"/>
+                <w:szCs w:val="20"/>
+              </w:rPr>
+            </w:pPr>
+            <w:r>
+              <w:rPr>
+                <w:rFonts w:ascii="맑은 고딕" w:eastAsia="맑은 고딕" w:hAnsi="맑은 고딕" w:cs="맑은 고딕"/>
+                <w:color w:val="000000"/>
+                <w:sz w:val="20"/>
+                <w:szCs w:val="20"/>
+              </w:rPr>
+              <w:t>0.1</w:t>
+            </w:r>
+          </w:p>
+        </w:tc>
+        <w:tc>
+          <w:tcPr>
+            <w:tcW w:w="1260" w:type="dxa"/>
+            <w:vAlign w:val="center"/>
+          </w:tcPr>
+          <w:p>
+            <w:pPr>
+              <w:pBdr>
+                <w:top w:val="nil"/>
+                <w:left w:val="nil"/>
+                <w:bottom w:val="nil"/>
+                <w:right w:val="nil"/>
+                <w:between w:val="nil"/>
+              </w:pBdr>
+              <w:jc w:val="center"/>
+              <w:rPr>
+                <w:rFonts w:ascii="맑은 고딕" w:eastAsia="맑은 고딕" w:hAnsi="맑은 고딕" w:cs="맑은 고딕"/>
+                <w:color w:val="000000"/>
+                <w:sz w:val="20"/>
+                <w:szCs w:val="20"/>
+              </w:rPr>
+            </w:pPr>
+            <w:r>
+              <w:rPr>
+                <w:rFonts w:ascii="맑은 고딕" w:eastAsia="맑은 고딕" w:hAnsi="맑은 고딕" w:cs="맑은 고딕"/>
+                <w:color w:val="000000"/>
+                <w:sz w:val="20"/>
+                <w:szCs w:val="20"/>
+              </w:rPr>
+              <w:t>202</w:t>
+            </w:r>
+            <w:r>
+              <w:rPr>
+                <w:rFonts w:ascii="맑은 고딕" w:eastAsia="맑은 고딕" w:hAnsi="맑은 고딕" w:cs="맑은 고딕" w:hint="eastAsia"/>
+                <w:color w:val="000000"/>
+                <w:sz w:val="20"/>
+                <w:szCs w:val="20"/>
+              </w:rPr>
+              <w:t>6</w:t>
+            </w:r>
+            <w:r>
+              <w:rPr>
+                <w:rFonts w:ascii="맑은 고딕" w:eastAsia="맑은 고딕" w:hAnsi="맑은 고딕" w:cs="맑은 고딕"/>
+                <w:color w:val="000000"/>
+                <w:sz w:val="20"/>
+                <w:szCs w:val="20"/>
+              </w:rPr>
+              <w:t>. 0</w:t>
+            </w:r>
+            <w:r>
+              <w:rPr>
+                <w:rFonts w:ascii="맑은 고딕" w:eastAsia="맑은 고딕" w:hAnsi="맑은 고딕" w:cs="맑은 고딕" w:hint="eastAsia"/>
+                <w:color w:val="000000"/>
+                <w:sz w:val="20"/>
+                <w:szCs w:val="20"/>
+              </w:rPr>
+              <w:t>4</w:t>
+            </w:r>
+            <w:r>
+              <w:rPr>
+                <w:rFonts w:ascii="맑은 고딕" w:eastAsia="맑은 고딕" w:hAnsi="맑은 고딕" w:cs="맑은 고딕"/>
+                <w:color w:val="000000"/>
+                <w:sz w:val="20"/>
+                <w:szCs w:val="20"/>
+              </w:rPr>
+              <w:t xml:space="preserve">. </w:t>
+            </w:r>
+            <w:r>
+              <w:rPr>
+                <w:rFonts w:ascii="맑은 고딕" w:eastAsia="맑은 고딕" w:hAnsi="맑은 고딕" w:cs="맑은 고딕" w:hint="eastAsia"/>
+                <w:color w:val="000000"/>
+                <w:sz w:val="20"/>
+                <w:szCs w:val="20"/>
+              </w:rPr>
+              <w:t>09</w:t>
+            </w:r>
+          </w:p>
+        </w:tc>
+        <w:tc>
+          <w:tcPr>
+            <w:tcW w:w="1560" w:type="dxa"/>
+            <w:vAlign w:val="center"/>
+          </w:tcPr>
+          <w:p>
+            <w:pPr>
+              <w:pBdr>
+                <w:top w:val="nil"/>
+                <w:left w:val="nil"/>
+                <w:bottom w:val="nil"/>
+                <w:right w:val="nil"/>
+                <w:between w:val="nil"/>
+              </w:pBdr>
+              <w:jc w:val="center"/>
+              <w:rPr>
+                <w:rFonts w:ascii="맑은 고딕" w:eastAsia="맑은 고딕" w:hAnsi="맑은 고딕" w:cs="맑은 고딕"/>
+                <w:color w:val="000000"/>
+                <w:sz w:val="20"/>
+                <w:szCs w:val="20"/>
+              </w:rPr>
+            </w:pPr>
+            <w:r>
+              <w:rPr>
+                <w:rFonts w:ascii="맑은 고딕" w:eastAsia="맑은 고딕" w:hAnsi="맑은 고딕" w:cs="맑은 고딕" w:hint="eastAsia"/>
+                <w:color w:val="000000"/>
+                <w:sz w:val="20"/>
+                <w:szCs w:val="20"/>
+              </w:rPr>
+              <w:t>임효진</w:t>
+            </w:r>
           </w:p>
         </w:tc>
         <w:tc>
@@ -4317,43 +4262,7 @@
           <w:sz w:val="28"/>
           <w:szCs w:val="28"/>
         </w:rPr>
-        <w:t xml:space="preserve">1. 비즈니스 </w:t>
-      </w:r>
-      <w:proofErr w:type="spellStart"/>
-      <w:r>
-        <w:rPr>
-          <w:rFonts w:ascii="맑은 고딕" w:eastAsia="맑은 고딕" w:hAnsi="맑은 고딕" w:cs="맑은 고딕"/>
-          <w:sz w:val="28"/>
-          <w:szCs w:val="28"/>
-        </w:rPr>
-        <w:t>유스케이스</w:t>
-      </w:r>
-      <w:proofErr w:type="spellEnd"/>
-      <w:r>
-        <w:rPr>
-          <w:rFonts w:ascii="맑은 고딕" w:eastAsia="맑은 고딕" w:hAnsi="맑은 고딕" w:cs="맑은 고딕"/>
-          <w:sz w:val="28"/>
-          <w:szCs w:val="28"/>
-        </w:rPr>
-        <w:t xml:space="preserve"> 다이어그램………………………………………</w:t>
-      </w:r>
-      <w:proofErr w:type="gramStart"/>
-      <w:r>
-        <w:rPr>
-          <w:rFonts w:ascii="맑은 고딕" w:eastAsia="맑은 고딕" w:hAnsi="맑은 고딕" w:cs="맑은 고딕"/>
-          <w:sz w:val="28"/>
-          <w:szCs w:val="28"/>
-        </w:rPr>
-        <w:t>……...</w:t>
-      </w:r>
-      <w:proofErr w:type="gramEnd"/>
-      <w:r>
-        <w:rPr>
-          <w:rFonts w:ascii="맑은 고딕" w:eastAsia="맑은 고딕" w:hAnsi="맑은 고딕" w:cs="맑은 고딕"/>
-          <w:sz w:val="28"/>
-          <w:szCs w:val="28"/>
-        </w:rPr>
-        <w:t>4</w:t>
+        <w:t>1. 비즈니스 유스케이스 다이어그램……………………………………………...4</w:t>
       </w:r>
     </w:p>
     <w:p>
@@ -4375,36 +4284,8 @@
           <w:sz w:val="28"/>
           <w:szCs w:val="28"/>
         </w:rPr>
-        <w:t xml:space="preserve">2. 비즈니스 </w:t>
+        <w:t>2. 비즈니스 유스케이스 목록………………………………………………………...</w:t>
       </w:r>
-      <w:proofErr w:type="spellStart"/>
-      <w:r>
-        <w:rPr>
-          <w:rFonts w:ascii="맑은 고딕" w:eastAsia="맑은 고딕" w:hAnsi="맑은 고딕" w:cs="맑은 고딕"/>
-          <w:sz w:val="28"/>
-          <w:szCs w:val="28"/>
-        </w:rPr>
-        <w:t>유스케이스</w:t>
-      </w:r>
-      <w:proofErr w:type="spellEnd"/>
-      <w:r>
-        <w:rPr>
-          <w:rFonts w:ascii="맑은 고딕" w:eastAsia="맑은 고딕" w:hAnsi="맑은 고딕" w:cs="맑은 고딕"/>
-          <w:sz w:val="28"/>
-          <w:szCs w:val="28"/>
-        </w:rPr>
-        <w:t xml:space="preserve"> 목록…………………………………………………</w:t>
-      </w:r>
-      <w:proofErr w:type="gramStart"/>
-      <w:r>
-        <w:rPr>
-          <w:rFonts w:ascii="맑은 고딕" w:eastAsia="맑은 고딕" w:hAnsi="맑은 고딕" w:cs="맑은 고딕"/>
-          <w:sz w:val="28"/>
-          <w:szCs w:val="28"/>
-        </w:rPr>
-        <w:t>……...</w:t>
-      </w:r>
-      <w:proofErr w:type="gramEnd"/>
       <w:r>
         <w:rPr>
           <w:rFonts w:ascii="맑은 고딕" w:eastAsia="맑은 고딕" w:hAnsi="맑은 고딕" w:cs="맑은 고딕" w:hint="eastAsia"/>
@@ -4433,25 +4314,7 @@
           <w:sz w:val="28"/>
           <w:szCs w:val="28"/>
         </w:rPr>
-        <w:t xml:space="preserve">3. 비즈니스 </w:t>
-      </w:r>
-      <w:proofErr w:type="spellStart"/>
-      <w:r>
-        <w:rPr>
-          <w:rFonts w:ascii="맑은 고딕" w:eastAsia="맑은 고딕" w:hAnsi="맑은 고딕" w:cs="맑은 고딕"/>
-          <w:sz w:val="28"/>
-          <w:szCs w:val="28"/>
-        </w:rPr>
-        <w:t>유스케이스</w:t>
-      </w:r>
-      <w:proofErr w:type="spellEnd"/>
-      <w:r>
-        <w:rPr>
-          <w:rFonts w:ascii="맑은 고딕" w:eastAsia="맑은 고딕" w:hAnsi="맑은 고딕" w:cs="맑은 고딕"/>
-          <w:sz w:val="28"/>
-          <w:szCs w:val="28"/>
-        </w:rPr>
-        <w:t xml:space="preserve"> 시나리오…………………………………………………</w:t>
+        <w:t>3. 비즈니스 유스케이스 시나리오…………………………………………………</w:t>
       </w:r>
       <w:r>
         <w:rPr>
@@ -4565,54 +4428,8 @@
           <w:sz w:val="28"/>
           <w:szCs w:val="28"/>
         </w:rPr>
-        <w:t xml:space="preserve">. 비즈니스 </w:t>
+        <w:t>. 비즈니스 객체/ 관계 목록/ 설명……………………………………………..</w:t>
       </w:r>
-      <w:proofErr w:type="gramStart"/>
-      <w:r>
-        <w:rPr>
-          <w:rFonts w:ascii="맑은 고딕" w:eastAsia="맑은 고딕" w:hAnsi="맑은 고딕" w:cs="맑은 고딕"/>
-          <w:sz w:val="28"/>
-          <w:szCs w:val="28"/>
-        </w:rPr>
-        <w:t>객체/ 관계</w:t>
-      </w:r>
-      <w:proofErr w:type="gramEnd"/>
-      <w:r>
-        <w:rPr>
-          <w:rFonts w:ascii="맑은 고딕" w:eastAsia="맑은 고딕" w:hAnsi="맑은 고딕" w:cs="맑은 고딕"/>
-          <w:sz w:val="28"/>
-          <w:szCs w:val="28"/>
-        </w:rPr>
-        <w:t xml:space="preserve"> </w:t>
-      </w:r>
-      <w:proofErr w:type="gramStart"/>
-      <w:r>
-        <w:rPr>
-          <w:rFonts w:ascii="맑은 고딕" w:eastAsia="맑은 고딕" w:hAnsi="맑은 고딕" w:cs="맑은 고딕"/>
-          <w:sz w:val="28"/>
-          <w:szCs w:val="28"/>
-        </w:rPr>
-        <w:t>목록/ 설명</w:t>
-      </w:r>
-      <w:proofErr w:type="gramEnd"/>
-      <w:r>
-        <w:rPr>
-          <w:rFonts w:ascii="맑은 고딕" w:eastAsia="맑은 고딕" w:hAnsi="맑은 고딕" w:cs="맑은 고딕"/>
-          <w:sz w:val="28"/>
-          <w:szCs w:val="28"/>
-        </w:rPr>
-        <w:t>………………………………………</w:t>
-      </w:r>
-      <w:proofErr w:type="gramStart"/>
-      <w:r>
-        <w:rPr>
-          <w:rFonts w:ascii="맑은 고딕" w:eastAsia="맑은 고딕" w:hAnsi="맑은 고딕" w:cs="맑은 고딕"/>
-          <w:sz w:val="28"/>
-          <w:szCs w:val="28"/>
-        </w:rPr>
-        <w:t>……..</w:t>
-      </w:r>
-      <w:proofErr w:type="gramEnd"/>
       <w:r>
         <w:rPr>
           <w:rFonts w:ascii="맑은 고딕" w:eastAsia="맑은 고딕" w:hAnsi="맑은 고딕" w:cs="맑은 고딕" w:hint="eastAsia"/>
@@ -4689,23 +4506,7 @@
           <w:b/>
         </w:rPr>
         <w:lastRenderedPageBreak/>
-        <w:t xml:space="preserve">비즈니스 </w:t>
-      </w:r>
-      <w:proofErr w:type="spellStart"/>
-      <w:r>
-        <w:rPr>
-          <w:rFonts w:ascii="맑은 고딕" w:eastAsia="맑은 고딕" w:hAnsi="맑은 고딕" w:cs="맑은 고딕"/>
-          <w:b/>
-        </w:rPr>
-        <w:t>유스케이스</w:t>
-      </w:r>
-      <w:proofErr w:type="spellEnd"/>
-      <w:r>
-        <w:rPr>
-          <w:rFonts w:ascii="맑은 고딕" w:eastAsia="맑은 고딕" w:hAnsi="맑은 고딕" w:cs="맑은 고딕"/>
-          <w:b/>
-        </w:rPr>
-        <w:t xml:space="preserve"> 다이어그램</w:t>
+        <w:t>비즈니스 유스케이스 다이어그램</w:t>
       </w:r>
     </w:p>
     <w:p>
@@ -4718,7 +4519,6 @@
           <w:color w:val="00B0F0"/>
         </w:rPr>
       </w:pPr>
-      <w:proofErr w:type="spellStart"/>
       <w:r>
         <w:rPr>
           <w:rFonts w:ascii="나눔고딕 ExtraBold" w:eastAsia="나눔고딕 ExtraBold" w:hAnsi="나눔고딕 ExtraBold" w:cs="나눔고딕 ExtraBold" w:hint="eastAsia"/>
@@ -4726,29 +4526,12 @@
         </w:rPr>
         <w:t>플래시톡</w:t>
       </w:r>
-      <w:proofErr w:type="spellEnd"/>
       <w:r>
         <w:rPr>
           <w:rFonts w:ascii="나눔고딕 ExtraBold" w:eastAsia="나눔고딕 ExtraBold" w:hAnsi="나눔고딕 ExtraBold" w:cs="나눔고딕 ExtraBold"/>
           <w:color w:val="00B0F0"/>
         </w:rPr>
-        <w:t xml:space="preserve"> 시스템 </w:t>
-      </w:r>
-      <w:proofErr w:type="spellStart"/>
-      <w:r>
-        <w:rPr>
-          <w:rFonts w:ascii="나눔고딕 ExtraBold" w:eastAsia="나눔고딕 ExtraBold" w:hAnsi="나눔고딕 ExtraBold" w:cs="나눔고딕 ExtraBold"/>
-          <w:color w:val="00B0F0"/>
-        </w:rPr>
-        <w:t>유스케이스</w:t>
-      </w:r>
-      <w:proofErr w:type="spellEnd"/>
-      <w:r>
-        <w:rPr>
-          <w:rFonts w:ascii="나눔고딕 ExtraBold" w:eastAsia="나눔고딕 ExtraBold" w:hAnsi="나눔고딕 ExtraBold" w:cs="나눔고딕 ExtraBold"/>
-          <w:color w:val="00B0F0"/>
-        </w:rPr>
-        <w:t xml:space="preserve"> 다이어그램</w:t>
+        <w:t xml:space="preserve"> 시스템 유스케이스 다이어그램</w:t>
       </w:r>
     </w:p>
     <w:tbl>
@@ -4949,23 +4732,7 @@
           <w:b/>
         </w:rPr>
         <w:lastRenderedPageBreak/>
-        <w:t xml:space="preserve">비즈니스 </w:t>
-      </w:r>
-      <w:proofErr w:type="spellStart"/>
-      <w:r>
-        <w:rPr>
-          <w:rFonts w:ascii="맑은 고딕" w:eastAsia="맑은 고딕" w:hAnsi="맑은 고딕" w:cs="맑은 고딕"/>
-          <w:b/>
-        </w:rPr>
-        <w:t>유스케이스</w:t>
-      </w:r>
-      <w:proofErr w:type="spellEnd"/>
-      <w:r>
-        <w:rPr>
-          <w:rFonts w:ascii="맑은 고딕" w:eastAsia="맑은 고딕" w:hAnsi="맑은 고딕" w:cs="맑은 고딕"/>
-          <w:b/>
-        </w:rPr>
-        <w:t xml:space="preserve"> 목록</w:t>
+        <w:t>비즈니스 유스케이스 목록</w:t>
       </w:r>
     </w:p>
     <w:p>
@@ -4986,7 +4753,6 @@
           <w:color w:val="00B0F0"/>
         </w:rPr>
       </w:pPr>
-      <w:proofErr w:type="spellStart"/>
       <w:r>
         <w:rPr>
           <w:rFonts w:ascii="맑은 고딕" w:eastAsia="맑은 고딕" w:hAnsi="맑은 고딕" w:cs="맑은 고딕" w:hint="eastAsia"/>
@@ -4995,7 +4761,6 @@
         </w:rPr>
         <w:t>플래시톡</w:t>
       </w:r>
-      <w:proofErr w:type="spellEnd"/>
       <w:r>
         <w:rPr>
           <w:rFonts w:ascii="나눔고딕 ExtraBold" w:eastAsia="나눔고딕 ExtraBold" w:hAnsi="나눔고딕 ExtraBold" w:cs="나눔고딕 ExtraBold"/>
@@ -5020,7 +4785,6 @@
         </w:rPr>
         <w:t xml:space="preserve">- </w:t>
       </w:r>
-      <w:proofErr w:type="spellStart"/>
       <w:r>
         <w:rPr>
           <w:rFonts w:ascii="맑은 고딕" w:eastAsia="맑은 고딕" w:hAnsi="맑은 고딕" w:cs="맑은 고딕"/>
@@ -5029,7 +4793,6 @@
         </w:rPr>
         <w:t>유스케이스</w:t>
       </w:r>
-      <w:proofErr w:type="spellEnd"/>
       <w:r>
         <w:rPr>
           <w:rFonts w:ascii="나눔고딕 ExtraBold" w:eastAsia="나눔고딕 ExtraBold" w:hAnsi="나눔고딕 ExtraBold" w:cs="나눔고딕 ExtraBold"/>
@@ -5086,19 +4849,11 @@
                 <w:rFonts w:ascii="맑은 고딕" w:eastAsia="맑은 고딕" w:hAnsi="맑은 고딕" w:cs="맑은 고딕"/>
               </w:rPr>
             </w:pPr>
-            <w:proofErr w:type="spellStart"/>
-            <w:r>
-              <w:rPr>
-                <w:rFonts w:ascii="맑은 고딕" w:eastAsia="맑은 고딕" w:hAnsi="맑은 고딕" w:cs="맑은 고딕"/>
-              </w:rPr>
-              <w:t>유스케이스</w:t>
-            </w:r>
-            <w:proofErr w:type="spellEnd"/>
-            <w:r>
-              <w:rPr>
-                <w:rFonts w:ascii="맑은 고딕" w:eastAsia="맑은 고딕" w:hAnsi="맑은 고딕" w:cs="맑은 고딕"/>
-              </w:rPr>
-              <w:t xml:space="preserve"> ID</w:t>
+            <w:r>
+              <w:rPr>
+                <w:rFonts w:ascii="맑은 고딕" w:eastAsia="맑은 고딕" w:hAnsi="맑은 고딕" w:cs="맑은 고딕"/>
+              </w:rPr>
+              <w:t>유스케이스 ID</w:t>
             </w:r>
           </w:p>
         </w:tc>
@@ -5113,19 +4868,11 @@
                 <w:rFonts w:ascii="맑은 고딕" w:eastAsia="맑은 고딕" w:hAnsi="맑은 고딕" w:cs="맑은 고딕"/>
               </w:rPr>
             </w:pPr>
-            <w:proofErr w:type="spellStart"/>
-            <w:r>
-              <w:rPr>
-                <w:rFonts w:ascii="맑은 고딕" w:eastAsia="맑은 고딕" w:hAnsi="맑은 고딕" w:cs="맑은 고딕"/>
-              </w:rPr>
-              <w:t>유스케이스</w:t>
-            </w:r>
-            <w:proofErr w:type="spellEnd"/>
-            <w:r>
-              <w:rPr>
-                <w:rFonts w:ascii="맑은 고딕" w:eastAsia="맑은 고딕" w:hAnsi="맑은 고딕" w:cs="맑은 고딕"/>
-              </w:rPr>
-              <w:t xml:space="preserve"> 명</w:t>
+            <w:r>
+              <w:rPr>
+                <w:rFonts w:ascii="맑은 고딕" w:eastAsia="맑은 고딕" w:hAnsi="맑은 고딕" w:cs="맑은 고딕"/>
+              </w:rPr>
+              <w:t>유스케이스 명</w:t>
             </w:r>
           </w:p>
         </w:tc>
@@ -5144,16 +4891,8 @@
               <w:rPr>
                 <w:rFonts w:ascii="맑은 고딕" w:eastAsia="맑은 고딕" w:hAnsi="맑은 고딕" w:cs="맑은 고딕"/>
               </w:rPr>
-              <w:t xml:space="preserve">주요 </w:t>
-            </w:r>
-            <w:proofErr w:type="spellStart"/>
-            <w:r>
-              <w:rPr>
-                <w:rFonts w:ascii="맑은 고딕" w:eastAsia="맑은 고딕" w:hAnsi="맑은 고딕" w:cs="맑은 고딕"/>
-              </w:rPr>
-              <w:t>액터</w:t>
-            </w:r>
-            <w:proofErr w:type="spellEnd"/>
+              <w:t>주요 액터</w:t>
+            </w:r>
           </w:p>
         </w:tc>
         <w:tc>
@@ -5970,16 +5709,8 @@
               <w:rPr>
                 <w:rFonts w:ascii="맑은 고딕" w:eastAsia="맑은 고딕" w:hAnsi="맑은 고딕" w:cs="맑은 고딕" w:hint="eastAsia"/>
               </w:rPr>
-              <w:t xml:space="preserve">AI </w:t>
-            </w:r>
-            <w:proofErr w:type="spellStart"/>
-            <w:r>
-              <w:rPr>
-                <w:rFonts w:ascii="맑은 고딕" w:eastAsia="맑은 고딕" w:hAnsi="맑은 고딕" w:cs="맑은 고딕" w:hint="eastAsia"/>
-              </w:rPr>
-              <w:t>챗봇</w:t>
-            </w:r>
-            <w:proofErr w:type="spellEnd"/>
+              <w:t>AI 챗봇</w:t>
+            </w:r>
           </w:p>
         </w:tc>
         <w:tc>
@@ -6276,23 +6007,7 @@
           <w:b/>
         </w:rPr>
         <w:lastRenderedPageBreak/>
-        <w:t xml:space="preserve">비즈니스 </w:t>
-      </w:r>
-      <w:proofErr w:type="spellStart"/>
-      <w:r>
-        <w:rPr>
-          <w:rFonts w:ascii="맑은 고딕" w:eastAsia="맑은 고딕" w:hAnsi="맑은 고딕" w:cs="맑은 고딕"/>
-          <w:b/>
-        </w:rPr>
-        <w:t>유스케이스</w:t>
-      </w:r>
-      <w:proofErr w:type="spellEnd"/>
-      <w:r>
-        <w:rPr>
-          <w:rFonts w:ascii="맑은 고딕" w:eastAsia="맑은 고딕" w:hAnsi="맑은 고딕" w:cs="맑은 고딕"/>
-          <w:b/>
-        </w:rPr>
-        <w:t xml:space="preserve"> 시나리오</w:t>
+        <w:t>비즈니스 유스케이스 시나리오</w:t>
       </w:r>
     </w:p>
     <w:p>
@@ -6306,7 +6021,6 @@
           <w:color w:val="00B0F0"/>
         </w:rPr>
       </w:pPr>
-      <w:proofErr w:type="spellStart"/>
       <w:r>
         <w:rPr>
           <w:rFonts w:ascii="나눔고딕 ExtraBold" w:eastAsia="나눔고딕 ExtraBold" w:hAnsi="나눔고딕 ExtraBold" w:cs="나눔고딕 ExtraBold" w:hint="eastAsia"/>
@@ -6315,32 +6029,13 @@
         </w:rPr>
         <w:t>플래시톡</w:t>
       </w:r>
-      <w:proofErr w:type="spellEnd"/>
       <w:r>
         <w:rPr>
           <w:rFonts w:ascii="나눔고딕 ExtraBold" w:eastAsia="나눔고딕 ExtraBold" w:hAnsi="나눔고딕 ExtraBold" w:cs="나눔고딕 ExtraBold"/>
           <w:b/>
           <w:color w:val="00B0F0"/>
         </w:rPr>
-        <w:t xml:space="preserve"> 시스템- </w:t>
-      </w:r>
-      <w:proofErr w:type="spellStart"/>
-      <w:r>
-        <w:rPr>
-          <w:rFonts w:ascii="나눔고딕 ExtraBold" w:eastAsia="나눔고딕 ExtraBold" w:hAnsi="나눔고딕 ExtraBold" w:cs="나눔고딕 ExtraBold"/>
-          <w:b/>
-          <w:color w:val="00B0F0"/>
-        </w:rPr>
-        <w:t>유스케이스</w:t>
-      </w:r>
-      <w:proofErr w:type="spellEnd"/>
-      <w:r>
-        <w:rPr>
-          <w:rFonts w:ascii="나눔고딕 ExtraBold" w:eastAsia="나눔고딕 ExtraBold" w:hAnsi="나눔고딕 ExtraBold" w:cs="나눔고딕 ExtraBold"/>
-          <w:b/>
-          <w:color w:val="00B0F0"/>
-        </w:rPr>
-        <w:t xml:space="preserve"> 시나리오</w:t>
+        <w:t xml:space="preserve"> 시스템- 유스케이스 시나리오</w:t>
       </w:r>
     </w:p>
     <w:p>
@@ -6626,14 +6321,12 @@
               </w:rPr>
               <w:t xml:space="preserve"> </w:t>
             </w:r>
-            <w:proofErr w:type="spellStart"/>
             <w:r>
               <w:rPr>
                 <w:b/>
               </w:rPr>
               <w:t>액터</w:t>
             </w:r>
-            <w:proofErr w:type="spellEnd"/>
           </w:p>
         </w:tc>
         <w:tc>
@@ -8093,14 +7786,12 @@
               </w:rPr>
               <w:t xml:space="preserve"> </w:t>
             </w:r>
-            <w:proofErr w:type="spellStart"/>
             <w:r>
               <w:rPr>
                 <w:b/>
               </w:rPr>
               <w:t>액터</w:t>
             </w:r>
-            <w:proofErr w:type="spellEnd"/>
           </w:p>
         </w:tc>
         <w:tc>
@@ -9402,14 +9093,12 @@
               </w:rPr>
               <w:t xml:space="preserve"> </w:t>
             </w:r>
-            <w:proofErr w:type="spellStart"/>
             <w:r>
               <w:rPr>
                 <w:b/>
               </w:rPr>
               <w:t>액터</w:t>
             </w:r>
-            <w:proofErr w:type="spellEnd"/>
           </w:p>
         </w:tc>
         <w:tc>
@@ -10788,14 +10477,12 @@
               </w:rPr>
               <w:t xml:space="preserve"> </w:t>
             </w:r>
-            <w:proofErr w:type="spellStart"/>
             <w:r>
               <w:rPr>
                 <w:b/>
               </w:rPr>
               <w:t>액터</w:t>
             </w:r>
-            <w:proofErr w:type="spellEnd"/>
           </w:p>
         </w:tc>
         <w:tc>
@@ -11753,14 +11440,12 @@
               </w:rPr>
               <w:t xml:space="preserve"> </w:t>
             </w:r>
-            <w:proofErr w:type="spellStart"/>
             <w:r>
               <w:rPr>
                 <w:b/>
               </w:rPr>
               <w:t>액터</w:t>
             </w:r>
-            <w:proofErr w:type="spellEnd"/>
           </w:p>
         </w:tc>
         <w:tc>
@@ -12743,14 +12428,12 @@
               </w:rPr>
               <w:t xml:space="preserve"> </w:t>
             </w:r>
-            <w:proofErr w:type="spellStart"/>
             <w:r>
               <w:rPr>
                 <w:b/>
               </w:rPr>
               <w:t>액터</w:t>
             </w:r>
-            <w:proofErr w:type="spellEnd"/>
           </w:p>
         </w:tc>
         <w:tc>
@@ -13644,7 +13327,6 @@
             <w:r>
               <w:t>“</w:t>
             </w:r>
-            <w:proofErr w:type="gramStart"/>
             <w:r>
               <w:rPr>
                 <w:rFonts w:hint="eastAsia"/>
@@ -13663,7 +13345,6 @@
               </w:rPr>
               <w:t>되지</w:t>
             </w:r>
-            <w:proofErr w:type="gramEnd"/>
             <w:r>
               <w:rPr>
                 <w:rFonts w:hint="eastAsia"/>
@@ -14161,14 +13842,12 @@
               </w:rPr>
               <w:t xml:space="preserve"> </w:t>
             </w:r>
-            <w:proofErr w:type="spellStart"/>
             <w:r>
               <w:rPr>
                 <w:b/>
               </w:rPr>
               <w:t>액터</w:t>
             </w:r>
-            <w:proofErr w:type="spellEnd"/>
           </w:p>
         </w:tc>
         <w:tc>
@@ -15503,14 +15182,12 @@
               </w:rPr>
               <w:t xml:space="preserve"> </w:t>
             </w:r>
-            <w:proofErr w:type="spellStart"/>
             <w:r>
               <w:rPr>
                 <w:b/>
               </w:rPr>
               <w:t>액터</w:t>
             </w:r>
-            <w:proofErr w:type="spellEnd"/>
           </w:p>
         </w:tc>
         <w:tc>
@@ -16691,14 +16368,12 @@
               </w:rPr>
               <w:t xml:space="preserve"> </w:t>
             </w:r>
-            <w:proofErr w:type="spellStart"/>
             <w:r>
               <w:rPr>
                 <w:b/>
               </w:rPr>
               <w:t>액터</w:t>
             </w:r>
-            <w:proofErr w:type="spellEnd"/>
           </w:p>
         </w:tc>
         <w:tc>
@@ -17630,7 +17305,6 @@
               </w:rPr>
               <w:t xml:space="preserve"> </w:t>
             </w:r>
-            <w:proofErr w:type="spellStart"/>
             <w:r>
               <w:rPr>
                 <w:rFonts w:hint="eastAsia"/>
@@ -17640,7 +17314,6 @@
             <w:r>
               <w:t>시키겠습니까</w:t>
             </w:r>
-            <w:proofErr w:type="spellEnd"/>
             <w:r>
               <w:rPr>
                 <w:rFonts w:hint="eastAsia"/>
@@ -17704,14 +17377,12 @@
             <w:r>
               <w:t>”</w:t>
             </w:r>
-            <w:proofErr w:type="spellStart"/>
             <w:r>
               <w:rPr>
                 <w:rFonts w:hint="eastAsia"/>
               </w:rPr>
               <w:t>를</w:t>
             </w:r>
-            <w:proofErr w:type="spellEnd"/>
             <w:r>
               <w:rPr>
                 <w:rFonts w:hint="eastAsia"/>
@@ -17742,7 +17413,6 @@
               </w:rPr>
               <w:t xml:space="preserve"> </w:t>
             </w:r>
-            <w:proofErr w:type="gramStart"/>
             <w:r>
               <w:rPr>
                 <w:rFonts w:hint="eastAsia"/>
@@ -17761,7 +17431,6 @@
               </w:rPr>
               <w:t>시키거나</w:t>
             </w:r>
-            <w:proofErr w:type="gramEnd"/>
             <w:r>
               <w:rPr>
                 <w:rFonts w:hint="eastAsia"/>
@@ -17780,14 +17449,12 @@
             <w:r>
               <w:t>”</w:t>
             </w:r>
-            <w:proofErr w:type="spellStart"/>
             <w:r>
               <w:rPr>
                 <w:rFonts w:hint="eastAsia"/>
               </w:rPr>
               <w:t>를</w:t>
             </w:r>
-            <w:proofErr w:type="spellEnd"/>
             <w:r>
               <w:rPr>
                 <w:rFonts w:hint="eastAsia"/>
@@ -18205,7 +17872,6 @@
           <w:color w:val="00B0F0"/>
         </w:rPr>
       </w:pPr>
-      <w:proofErr w:type="spellStart"/>
       <w:r>
         <w:rPr>
           <w:rFonts w:ascii="나눔고딕 ExtraBold" w:eastAsia="나눔고딕 ExtraBold" w:hAnsi="나눔고딕 ExtraBold" w:cs="나눔고딕 ExtraBold" w:hint="eastAsia"/>
@@ -18213,7 +17879,6 @@
         </w:rPr>
         <w:t>플래시톡</w:t>
       </w:r>
-      <w:proofErr w:type="spellEnd"/>
       <w:r>
         <w:rPr>
           <w:rFonts w:ascii="나눔고딕 ExtraBold" w:eastAsia="나눔고딕 ExtraBold" w:hAnsi="나눔고딕 ExtraBold" w:cs="나눔고딕 ExtraBold"/>
@@ -18244,6 +17909,22 @@
         <w:pict w14:anchorId="109E91AB">
           <v:rect id="_x0000_i1030" style="width:0;height:1.5pt" o:hralign="center" o:hrstd="t" o:hr="t" fillcolor="#a0a0a0" stroked="f"/>
         </w:pict>
+      </w:r>
+      <w:r>
+        <w:rPr>
+          <w:rFonts w:asciiTheme="minorHAnsi" w:eastAsiaTheme="minorHAnsi" w:hAnsiTheme="minorHAnsi" w:hint="eastAsia"/>
+          <w:b/>
+          <w:bCs/>
+          <w:sz w:val="24"/>
+          <w:szCs w:val="24"/>
+        </w:rPr>
+        <w:t>AD-01</w:t>
+      </w:r>
+      <w:r>
+        <w:rPr>
+          <w:rFonts w:hint="eastAsia"/>
+        </w:rPr>
+        <w:t xml:space="preserve"> </w:t>
       </w:r>
       <w:r>
         <w:rPr>
@@ -18487,6 +18168,32 @@
       </w:pPr>
       <w:r>
         <w:rPr>
+          <w:rFonts w:asciiTheme="minorHAnsi" w:eastAsiaTheme="minorHAnsi" w:hAnsiTheme="minorHAnsi" w:hint="eastAsia"/>
+          <w:b/>
+          <w:bCs/>
+          <w:sz w:val="24"/>
+          <w:szCs w:val="24"/>
+        </w:rPr>
+        <w:t>AD-0</w:t>
+      </w:r>
+      <w:r>
+        <w:rPr>
+          <w:rFonts w:asciiTheme="minorHAnsi" w:eastAsiaTheme="minorHAnsi" w:hAnsiTheme="minorHAnsi" w:hint="eastAsia"/>
+          <w:b/>
+          <w:bCs/>
+          <w:sz w:val="24"/>
+          <w:szCs w:val="24"/>
+        </w:rPr>
+        <w:t>2</w:t>
+      </w:r>
+      <w:r>
+        <w:rPr>
+          <w:rFonts w:hint="eastAsia"/>
+        </w:rPr>
+        <w:t xml:space="preserve"> </w:t>
+      </w:r>
+      <w:r>
+        <w:rPr>
           <w:rFonts w:hint="eastAsia"/>
           <w:b/>
           <w:sz w:val="24"/>
@@ -18736,6 +18443,7 @@
       <w:pPr>
         <w:spacing w:line="276" w:lineRule="auto"/>
         <w:rPr>
+          <w:rFonts w:asciiTheme="minorHAnsi" w:eastAsiaTheme="minorHAnsi" w:hAnsiTheme="minorHAnsi"/>
           <w:b/>
           <w:sz w:val="24"/>
           <w:szCs w:val="24"/>
@@ -18743,7 +18451,27 @@
       </w:pPr>
       <w:r>
         <w:rPr>
-          <w:rFonts w:hint="eastAsia"/>
+          <w:rFonts w:asciiTheme="minorHAnsi" w:eastAsiaTheme="minorHAnsi" w:hAnsiTheme="minorHAnsi" w:hint="eastAsia"/>
+          <w:b/>
+          <w:bCs/>
+          <w:sz w:val="24"/>
+          <w:szCs w:val="24"/>
+        </w:rPr>
+        <w:t>AD-0</w:t>
+      </w:r>
+      <w:r>
+        <w:rPr>
+          <w:rFonts w:asciiTheme="minorHAnsi" w:eastAsiaTheme="minorHAnsi" w:hAnsiTheme="minorHAnsi" w:hint="eastAsia"/>
+          <w:b/>
+          <w:bCs/>
+          <w:sz w:val="24"/>
+          <w:szCs w:val="24"/>
+        </w:rPr>
+        <w:t xml:space="preserve">3 </w:t>
+      </w:r>
+      <w:r>
+        <w:rPr>
+          <w:rFonts w:asciiTheme="minorHAnsi" w:eastAsiaTheme="minorHAnsi" w:hAnsiTheme="minorHAnsi" w:hint="eastAsia"/>
           <w:b/>
           <w:sz w:val="24"/>
           <w:szCs w:val="24"/>
@@ -18752,7 +18480,7 @@
       </w:r>
       <w:r>
         <w:rPr>
-          <w:rFonts w:hint="eastAsia"/>
+          <w:rFonts w:asciiTheme="minorHAnsi" w:eastAsiaTheme="minorHAnsi" w:hAnsiTheme="minorHAnsi" w:hint="eastAsia"/>
           <w:b/>
           <w:sz w:val="24"/>
           <w:szCs w:val="24"/>
@@ -19003,6 +18731,32 @@
       </w:pPr>
       <w:r>
         <w:rPr>
+          <w:rFonts w:asciiTheme="minorHAnsi" w:eastAsiaTheme="minorHAnsi" w:hAnsiTheme="minorHAnsi" w:hint="eastAsia"/>
+          <w:b/>
+          <w:bCs/>
+          <w:sz w:val="24"/>
+          <w:szCs w:val="24"/>
+        </w:rPr>
+        <w:t>AD-0</w:t>
+      </w:r>
+      <w:r>
+        <w:rPr>
+          <w:rFonts w:asciiTheme="minorHAnsi" w:eastAsiaTheme="minorHAnsi" w:hAnsiTheme="minorHAnsi" w:hint="eastAsia"/>
+          <w:b/>
+          <w:bCs/>
+          <w:sz w:val="24"/>
+          <w:szCs w:val="24"/>
+        </w:rPr>
+        <w:t>4</w:t>
+      </w:r>
+      <w:r>
+        <w:rPr>
+          <w:rFonts w:hint="eastAsia"/>
+        </w:rPr>
+        <w:t xml:space="preserve"> </w:t>
+      </w:r>
+      <w:r>
+        <w:rPr>
           <w:rFonts w:hint="eastAsia"/>
           <w:b/>
           <w:sz w:val="24"/>
@@ -19271,6 +19025,32 @@
       </w:pPr>
       <w:r>
         <w:rPr>
+          <w:rFonts w:asciiTheme="minorHAnsi" w:eastAsiaTheme="minorHAnsi" w:hAnsiTheme="minorHAnsi" w:hint="eastAsia"/>
+          <w:b/>
+          <w:bCs/>
+          <w:sz w:val="24"/>
+          <w:szCs w:val="24"/>
+        </w:rPr>
+        <w:t>AD-0</w:t>
+      </w:r>
+      <w:r>
+        <w:rPr>
+          <w:rFonts w:asciiTheme="minorHAnsi" w:eastAsiaTheme="minorHAnsi" w:hAnsiTheme="minorHAnsi" w:hint="eastAsia"/>
+          <w:b/>
+          <w:bCs/>
+          <w:sz w:val="24"/>
+          <w:szCs w:val="24"/>
+        </w:rPr>
+        <w:t>5</w:t>
+      </w:r>
+      <w:r>
+        <w:rPr>
+          <w:rFonts w:hint="eastAsia"/>
+        </w:rPr>
+        <w:t xml:space="preserve"> </w:t>
+      </w:r>
+      <w:r>
+        <w:rPr>
           <w:rFonts w:hint="eastAsia"/>
           <w:b/>
           <w:sz w:val="24"/>
@@ -19493,6 +19273,32 @@
       </w:pPr>
       <w:r>
         <w:rPr>
+          <w:rFonts w:asciiTheme="minorHAnsi" w:eastAsiaTheme="minorHAnsi" w:hAnsiTheme="minorHAnsi" w:hint="eastAsia"/>
+          <w:b/>
+          <w:bCs/>
+          <w:sz w:val="24"/>
+          <w:szCs w:val="24"/>
+        </w:rPr>
+        <w:t>AD-0</w:t>
+      </w:r>
+      <w:r>
+        <w:rPr>
+          <w:rFonts w:asciiTheme="minorHAnsi" w:eastAsiaTheme="minorHAnsi" w:hAnsiTheme="minorHAnsi" w:hint="eastAsia"/>
+          <w:b/>
+          <w:bCs/>
+          <w:sz w:val="24"/>
+          <w:szCs w:val="24"/>
+        </w:rPr>
+        <w:t>6</w:t>
+      </w:r>
+      <w:r>
+        <w:rPr>
+          <w:rFonts w:hint="eastAsia"/>
+        </w:rPr>
+        <w:t xml:space="preserve"> </w:t>
+      </w:r>
+      <w:r>
+        <w:rPr>
           <w:rFonts w:hint="eastAsia"/>
           <w:b/>
           <w:sz w:val="24"/>
@@ -19715,6 +19521,32 @@
       </w:pPr>
       <w:r>
         <w:rPr>
+          <w:rFonts w:asciiTheme="minorHAnsi" w:eastAsiaTheme="minorHAnsi" w:hAnsiTheme="minorHAnsi" w:hint="eastAsia"/>
+          <w:b/>
+          <w:bCs/>
+          <w:sz w:val="24"/>
+          <w:szCs w:val="24"/>
+        </w:rPr>
+        <w:t>AD-0</w:t>
+      </w:r>
+      <w:r>
+        <w:rPr>
+          <w:rFonts w:asciiTheme="minorHAnsi" w:eastAsiaTheme="minorHAnsi" w:hAnsiTheme="minorHAnsi" w:hint="eastAsia"/>
+          <w:b/>
+          <w:bCs/>
+          <w:sz w:val="24"/>
+          <w:szCs w:val="24"/>
+        </w:rPr>
+        <w:t>7</w:t>
+      </w:r>
+      <w:r>
+        <w:rPr>
+          <w:rFonts w:hint="eastAsia"/>
+        </w:rPr>
+        <w:t xml:space="preserve"> </w:t>
+      </w:r>
+      <w:r>
+        <w:rPr>
           <w:rFonts w:hint="eastAsia"/>
           <w:b/>
           <w:sz w:val="24"/>
@@ -19926,6 +19758,32 @@
       </w:pPr>
       <w:r>
         <w:rPr>
+          <w:rFonts w:asciiTheme="minorHAnsi" w:eastAsiaTheme="minorHAnsi" w:hAnsiTheme="minorHAnsi" w:hint="eastAsia"/>
+          <w:b/>
+          <w:bCs/>
+          <w:sz w:val="24"/>
+          <w:szCs w:val="24"/>
+        </w:rPr>
+        <w:t>AD-0</w:t>
+      </w:r>
+      <w:r>
+        <w:rPr>
+          <w:rFonts w:asciiTheme="minorHAnsi" w:eastAsiaTheme="minorHAnsi" w:hAnsiTheme="minorHAnsi" w:hint="eastAsia"/>
+          <w:b/>
+          <w:bCs/>
+          <w:sz w:val="24"/>
+          <w:szCs w:val="24"/>
+        </w:rPr>
+        <w:t>8</w:t>
+      </w:r>
+      <w:r>
+        <w:rPr>
+          <w:rFonts w:hint="eastAsia"/>
+        </w:rPr>
+        <w:t xml:space="preserve"> </w:t>
+      </w:r>
+      <w:r>
+        <w:rPr>
           <w:rFonts w:hint="eastAsia"/>
           <w:b/>
           <w:sz w:val="24"/>
@@ -20204,6 +20062,32 @@
       </w:pPr>
       <w:r>
         <w:rPr>
+          <w:rFonts w:asciiTheme="minorHAnsi" w:eastAsiaTheme="minorHAnsi" w:hAnsiTheme="minorHAnsi" w:hint="eastAsia"/>
+          <w:b/>
+          <w:bCs/>
+          <w:sz w:val="24"/>
+          <w:szCs w:val="24"/>
+        </w:rPr>
+        <w:t>AD-0</w:t>
+      </w:r>
+      <w:r>
+        <w:rPr>
+          <w:rFonts w:asciiTheme="minorHAnsi" w:eastAsiaTheme="minorHAnsi" w:hAnsiTheme="minorHAnsi" w:hint="eastAsia"/>
+          <w:b/>
+          <w:bCs/>
+          <w:sz w:val="24"/>
+          <w:szCs w:val="24"/>
+        </w:rPr>
+        <w:t>9</w:t>
+      </w:r>
+      <w:r>
+        <w:rPr>
+          <w:rFonts w:hint="eastAsia"/>
+        </w:rPr>
+        <w:t xml:space="preserve"> </w:t>
+      </w:r>
+      <w:r>
+        <w:rPr>
           <w:rFonts w:hint="eastAsia"/>
           <w:b/>
           <w:sz w:val="24"/>
@@ -20406,6 +20290,27 @@
       <w:pPr>
         <w:widowControl/>
         <w:spacing w:line="276" w:lineRule="auto"/>
+        <w:rPr>
+          <w:rFonts w:hint="eastAsia"/>
+        </w:rPr>
+      </w:pPr>
+    </w:p>
+    <w:p>
+      <w:pPr>
+        <w:widowControl/>
+        <w:spacing w:line="276" w:lineRule="auto"/>
+      </w:pPr>
+    </w:p>
+    <w:p>
+      <w:pPr>
+        <w:widowControl/>
+        <w:spacing w:line="276" w:lineRule="auto"/>
+      </w:pPr>
+    </w:p>
+    <w:p>
+      <w:pPr>
+        <w:widowControl/>
+        <w:spacing w:line="276" w:lineRule="auto"/>
       </w:pPr>
     </w:p>
     <w:p>
@@ -20438,6 +20343,7 @@
           <w:rFonts w:ascii="맑은 고딕" w:eastAsia="맑은 고딕" w:hAnsi="맑은 고딕" w:cs="맑은 고딕"/>
           <w:b/>
         </w:rPr>
+        <w:lastRenderedPageBreak/>
         <w:t>비즈니스 객체 다이어그램</w:t>
       </w:r>
     </w:p>
@@ -20452,7 +20358,6 @@
           <w:color w:val="00B0F0"/>
         </w:rPr>
       </w:pPr>
-      <w:proofErr w:type="spellStart"/>
       <w:r>
         <w:rPr>
           <w:rFonts w:ascii="나눔고딕 ExtraBold" w:eastAsia="나눔고딕 ExtraBold" w:hAnsi="나눔고딕 ExtraBold" w:cs="나눔고딕 ExtraBold" w:hint="eastAsia"/>
@@ -20461,25 +20366,14 @@
         </w:rPr>
         <w:t>플래시톡</w:t>
       </w:r>
-      <w:proofErr w:type="spellEnd"/>
       <w:r>
         <w:rPr>
           <w:rFonts w:ascii="나눔고딕 ExtraBold" w:eastAsia="나눔고딕 ExtraBold" w:hAnsi="나눔고딕 ExtraBold" w:cs="나눔고딕 ExtraBold"/>
           <w:b/>
           <w:color w:val="00B0F0"/>
         </w:rPr>
-        <w:t xml:space="preserve"> 시스템 </w:t>
+        <w:t xml:space="preserve"> 시스템 객체다이어그램</w:t>
       </w:r>
-      <w:proofErr w:type="spellStart"/>
-      <w:r>
-        <w:rPr>
-          <w:rFonts w:ascii="나눔고딕 ExtraBold" w:eastAsia="나눔고딕 ExtraBold" w:hAnsi="나눔고딕 ExtraBold" w:cs="나눔고딕 ExtraBold"/>
-          <w:b/>
-          <w:color w:val="00B0F0"/>
-        </w:rPr>
-        <w:t>객체다이어그램</w:t>
-      </w:r>
-      <w:proofErr w:type="spellEnd"/>
     </w:p>
     <w:tbl>
       <w:tblPr>
@@ -20521,7 +20415,6 @@
                 <w:color w:val="00B0F0"/>
                 <w14:ligatures w14:val="standardContextual"/>
               </w:rPr>
-              <w:lastRenderedPageBreak/>
               <w:drawing>
                 <wp:inline distT="0" distB="0" distL="0" distR="0" wp14:anchorId="4F1F85BE" wp14:editId="4A80A9F4">
                   <wp:extent cx="5126990" cy="3208020"/>
@@ -20610,7 +20503,6 @@
           <w:b/>
         </w:rPr>
       </w:pPr>
-      <w:proofErr w:type="spellStart"/>
       <w:r>
         <w:rPr>
           <w:rFonts w:ascii="나눔고딕 ExtraBold" w:eastAsia="나눔고딕 ExtraBold" w:hAnsi="나눔고딕 ExtraBold" w:cs="나눔고딕 ExtraBold" w:hint="eastAsia"/>
@@ -20618,7 +20510,6 @@
         </w:rPr>
         <w:t>플래시톡</w:t>
       </w:r>
-      <w:proofErr w:type="spellEnd"/>
       <w:r>
         <w:rPr>
           <w:rFonts w:ascii="나눔고딕 ExtraBold" w:eastAsia="나눔고딕 ExtraBold" w:hAnsi="나눔고딕 ExtraBold" w:cs="나눔고딕 ExtraBold"/>
@@ -20636,7 +20527,6 @@
           <w:szCs w:val="22"/>
         </w:rPr>
       </w:pPr>
-      <w:proofErr w:type="spellStart"/>
       <w:r>
         <w:rPr>
           <w:rFonts w:ascii="맑은 고딕" w:eastAsia="맑은 고딕" w:hAnsi="맑은 고딕" w:cs="맑은 고딕" w:hint="eastAsia"/>
@@ -20645,7 +20535,6 @@
         </w:rPr>
         <w:t>플래시톡</w:t>
       </w:r>
-      <w:proofErr w:type="spellEnd"/>
       <w:r>
         <w:rPr>
           <w:rFonts w:ascii="맑은 고딕" w:eastAsia="맑은 고딕" w:hAnsi="맑은 고딕" w:cs="맑은 고딕"/>
@@ -20713,14 +20602,12 @@
                 <w:rFonts w:ascii="맑은 고딕" w:eastAsia="맑은 고딕" w:hAnsi="맑은 고딕" w:cs="맑은 고딕"/>
               </w:rPr>
             </w:pPr>
-            <w:proofErr w:type="spellStart"/>
             <w:r>
               <w:rPr>
                 <w:rFonts w:ascii="맑은 고딕" w:eastAsia="맑은 고딕" w:hAnsi="맑은 고딕" w:cs="맑은 고딕"/>
               </w:rPr>
               <w:t>객체명</w:t>
             </w:r>
-            <w:proofErr w:type="spellEnd"/>
           </w:p>
         </w:tc>
         <w:tc>
@@ -21221,6 +21108,7 @@
               <w:rPr>
                 <w:rFonts w:ascii="맑은 고딕" w:eastAsia="맑은 고딕" w:hAnsi="맑은 고딕" w:cs="맑은 고딕"/>
               </w:rPr>
+              <w:lastRenderedPageBreak/>
               <w:t>BO-06</w:t>
             </w:r>
           </w:p>
@@ -21365,7 +21253,6 @@
               <w:rPr>
                 <w:rFonts w:ascii="맑은 고딕" w:eastAsia="맑은 고딕" w:hAnsi="맑은 고딕" w:cs="맑은 고딕"/>
               </w:rPr>
-              <w:lastRenderedPageBreak/>
               <w:t>BO-08</w:t>
             </w:r>
           </w:p>
@@ -21412,21 +21299,7 @@
               <w:rPr>
                 <w:rFonts w:ascii="맑은 고딕" w:eastAsia="맑은 고딕" w:hAnsi="맑은 고딕" w:cs="맑은 고딕" w:hint="eastAsia"/>
               </w:rPr>
-              <w:t xml:space="preserve"> AI </w:t>
-            </w:r>
-            <w:proofErr w:type="spellStart"/>
-            <w:r>
-              <w:rPr>
-                <w:rFonts w:ascii="맑은 고딕" w:eastAsia="맑은 고딕" w:hAnsi="맑은 고딕" w:cs="맑은 고딕" w:hint="eastAsia"/>
-              </w:rPr>
-              <w:t>챗봇</w:t>
-            </w:r>
-            <w:proofErr w:type="spellEnd"/>
-            <w:r>
-              <w:rPr>
-                <w:rFonts w:ascii="맑은 고딕" w:eastAsia="맑은 고딕" w:hAnsi="맑은 고딕" w:cs="맑은 고딕" w:hint="eastAsia"/>
-              </w:rPr>
-              <w:t xml:space="preserve"> 시스템, 메시지 중계 시스템</w:t>
+              <w:t xml:space="preserve"> AI 챗봇 시스템, 메시지 중계 시스템</w:t>
             </w:r>
           </w:p>
         </w:tc>
@@ -21448,7 +21321,6 @@
           <w:szCs w:val="22"/>
         </w:rPr>
       </w:pPr>
-      <w:proofErr w:type="spellStart"/>
       <w:r>
         <w:rPr>
           <w:rFonts w:ascii="맑은 고딕" w:eastAsia="맑은 고딕" w:hAnsi="맑은 고딕" w:cs="맑은 고딕" w:hint="eastAsia"/>
@@ -21457,7 +21329,6 @@
         </w:rPr>
         <w:t>플래시톡</w:t>
       </w:r>
-      <w:proofErr w:type="spellEnd"/>
       <w:r>
         <w:rPr>
           <w:rFonts w:ascii="맑은 고딕" w:eastAsia="맑은 고딕" w:hAnsi="맑은 고딕" w:cs="맑은 고딕"/>
@@ -21525,14 +21396,12 @@
                 <w:rFonts w:ascii="맑은 고딕" w:eastAsia="맑은 고딕" w:hAnsi="맑은 고딕" w:cs="맑은 고딕"/>
               </w:rPr>
             </w:pPr>
-            <w:proofErr w:type="spellStart"/>
             <w:r>
               <w:rPr>
                 <w:rFonts w:ascii="맑은 고딕" w:eastAsia="맑은 고딕" w:hAnsi="맑은 고딕" w:cs="맑은 고딕"/>
               </w:rPr>
               <w:t>워커명</w:t>
             </w:r>
-            <w:proofErr w:type="spellEnd"/>
           </w:p>
         </w:tc>
         <w:tc>
@@ -22011,41 +21880,34 @@
               <w:rPr>
                 <w:rFonts w:ascii="맑은 고딕" w:eastAsia="맑은 고딕" w:hAnsi="맑은 고딕" w:cs="맑은 고딕" w:hint="eastAsia"/>
               </w:rPr>
-              <w:t xml:space="preserve">AI </w:t>
-            </w:r>
-            <w:proofErr w:type="spellStart"/>
+              <w:t>AI 챗봇 시스템</w:t>
+            </w:r>
+          </w:p>
+        </w:tc>
+        <w:tc>
+          <w:tcPr>
+            <w:tcW w:w="4241" w:type="dxa"/>
+            <w:vAlign w:val="center"/>
+          </w:tcPr>
+          <w:p>
+            <w:pPr>
+              <w:jc w:val="center"/>
+              <w:rPr>
+                <w:rFonts w:ascii="맑은 고딕" w:eastAsia="맑은 고딕" w:hAnsi="맑은 고딕" w:cs="맑은 고딕"/>
+              </w:rPr>
+            </w:pPr>
             <w:r>
               <w:rPr>
                 <w:rFonts w:ascii="맑은 고딕" w:eastAsia="맑은 고딕" w:hAnsi="맑은 고딕" w:cs="맑은 고딕" w:hint="eastAsia"/>
               </w:rPr>
-              <w:t>챗봇</w:t>
-            </w:r>
-            <w:proofErr w:type="spellEnd"/>
+              <w:t xml:space="preserve">외부 대화형 AI 시스템과 연동해 사용자가 입력한 프롬프트를 분석한 다음 생성된 답변을 메시지 중계 </w:t>
+            </w:r>
             <w:r>
               <w:rPr>
                 <w:rFonts w:ascii="맑은 고딕" w:eastAsia="맑은 고딕" w:hAnsi="맑은 고딕" w:cs="맑은 고딕" w:hint="eastAsia"/>
               </w:rPr>
-              <w:t xml:space="preserve"> 시스템</w:t>
-            </w:r>
-          </w:p>
-        </w:tc>
-        <w:tc>
-          <w:tcPr>
-            <w:tcW w:w="4241" w:type="dxa"/>
-            <w:vAlign w:val="center"/>
-          </w:tcPr>
-          <w:p>
-            <w:pPr>
-              <w:jc w:val="center"/>
-              <w:rPr>
-                <w:rFonts w:ascii="맑은 고딕" w:eastAsia="맑은 고딕" w:hAnsi="맑은 고딕" w:cs="맑은 고딕"/>
-              </w:rPr>
-            </w:pPr>
-            <w:r>
-              <w:rPr>
-                <w:rFonts w:ascii="맑은 고딕" w:eastAsia="맑은 고딕" w:hAnsi="맑은 고딕" w:cs="맑은 고딕" w:hint="eastAsia"/>
-              </w:rPr>
-              <w:t xml:space="preserve">외부 대화형 AI 시스템과 연동해 사용자가 입력한 프롬프트를 분석한 다음 생성된 답변을 메시지 중계 시스템에 제공한다. </w:t>
+              <w:lastRenderedPageBreak/>
+              <w:t xml:space="preserve">시스템에 제공한다. </w:t>
             </w:r>
           </w:p>
         </w:tc>
@@ -22071,6 +21933,7 @@
               <w:rPr>
                 <w:rFonts w:ascii="맑은 고딕" w:eastAsia="맑은 고딕" w:hAnsi="맑은 고딕" w:cs="맑은 고딕" w:hint="eastAsia"/>
               </w:rPr>
+              <w:lastRenderedPageBreak/>
               <w:t>BW-08</w:t>
             </w:r>
           </w:p>
@@ -22137,7 +22000,6 @@
               <w:rPr>
                 <w:rFonts w:ascii="맑은 고딕" w:eastAsia="맑은 고딕" w:hAnsi="맑은 고딕" w:cs="맑은 고딕" w:hint="eastAsia"/>
               </w:rPr>
-              <w:lastRenderedPageBreak/>
               <w:t>BW-09</w:t>
             </w:r>
           </w:p>
@@ -22178,21 +22040,7 @@
               <w:rPr>
                 <w:rFonts w:ascii="맑은 고딕" w:eastAsia="맑은 고딕" w:hAnsi="맑은 고딕" w:cs="맑은 고딕" w:hint="eastAsia"/>
               </w:rPr>
-              <w:t xml:space="preserve">로그 감사 시스템이 제공한 데이터에 따라 실시간 </w:t>
-            </w:r>
-            <w:proofErr w:type="spellStart"/>
-            <w:r>
-              <w:rPr>
-                <w:rFonts w:ascii="맑은 고딕" w:eastAsia="맑은 고딕" w:hAnsi="맑은 고딕" w:cs="맑은 고딕" w:hint="eastAsia"/>
-              </w:rPr>
-              <w:t>접속자</w:t>
-            </w:r>
-            <w:proofErr w:type="spellEnd"/>
-            <w:r>
-              <w:rPr>
-                <w:rFonts w:ascii="맑은 고딕" w:eastAsia="맑은 고딕" w:hAnsi="맑은 고딕" w:cs="맑은 고딕" w:hint="eastAsia"/>
-              </w:rPr>
-              <w:t xml:space="preserve"> 수, 활성 대화방 수, 에러 여부 등을 </w:t>
+              <w:t xml:space="preserve">로그 감사 시스템이 제공한 데이터에 따라 실시간 접속자 수, 활성 대화방 수, 에러 여부 등을 </w:t>
             </w:r>
             <w:r>
               <w:rPr>
@@ -22352,7 +22200,6 @@
           <w:szCs w:val="22"/>
         </w:rPr>
       </w:pPr>
-      <w:proofErr w:type="spellStart"/>
       <w:r>
         <w:rPr>
           <w:rFonts w:ascii="맑은 고딕" w:eastAsia="맑은 고딕" w:hAnsi="맑은 고딕" w:cs="맑은 고딕" w:hint="eastAsia"/>
@@ -22361,7 +22208,6 @@
         </w:rPr>
         <w:t>플래시톡</w:t>
       </w:r>
-      <w:proofErr w:type="spellEnd"/>
       <w:r>
         <w:rPr>
           <w:rFonts w:ascii="맑은 고딕" w:eastAsia="맑은 고딕" w:hAnsi="맑은 고딕" w:cs="맑은 고딕"/>
@@ -22437,14 +22283,12 @@
                 <w:rFonts w:ascii="맑은 고딕" w:eastAsia="맑은 고딕" w:hAnsi="맑은 고딕" w:cs="맑은 고딕"/>
               </w:rPr>
             </w:pPr>
-            <w:proofErr w:type="spellStart"/>
             <w:r>
               <w:rPr>
                 <w:rFonts w:ascii="맑은 고딕" w:eastAsia="맑은 고딕" w:hAnsi="맑은 고딕" w:cs="맑은 고딕"/>
               </w:rPr>
               <w:t>객체명</w:t>
             </w:r>
-            <w:proofErr w:type="spellEnd"/>
           </w:p>
         </w:tc>
         <w:tc>
@@ -22828,21 +22672,7 @@
               <w:rPr>
                 <w:rFonts w:ascii="맑은 고딕" w:eastAsia="맑은 고딕" w:hAnsi="맑은 고딕" w:cs="맑은 고딕" w:hint="eastAsia"/>
               </w:rPr>
-              <w:t xml:space="preserve">사용자가 입력한 정보에 따라 외부 지도 연계 시스템에서 가져온 해당 위치의 </w:t>
-            </w:r>
-            <w:proofErr w:type="spellStart"/>
-            <w:r>
-              <w:rPr>
-                <w:rFonts w:ascii="맑은 고딕" w:eastAsia="맑은 고딕" w:hAnsi="맑은 고딕" w:cs="맑은 고딕" w:hint="eastAsia"/>
-              </w:rPr>
-              <w:t>장소명</w:t>
-            </w:r>
-            <w:proofErr w:type="spellEnd"/>
-            <w:r>
-              <w:rPr>
-                <w:rFonts w:ascii="맑은 고딕" w:eastAsia="맑은 고딕" w:hAnsi="맑은 고딕" w:cs="맑은 고딕" w:hint="eastAsia"/>
-              </w:rPr>
-              <w:t>, 전체 주소, 위도와 경도, 웹 링크, 지도 미리보기 이미지 주소 등을 기록하는 객체.</w:t>
+              <w:t>사용자가 입력한 정보에 따라 외부 지도 연계 시스템에서 가져온 해당 위치의 장소명, 전체 주소, 위도와 경도, 웹 링크, 지도 미리보기 이미지 주소 등을 기록하는 객체.</w:t>
             </w:r>
           </w:p>
         </w:tc>
@@ -22864,6 +22694,7 @@
               <w:rPr>
                 <w:rFonts w:ascii="맑은 고딕" w:eastAsia="맑은 고딕" w:hAnsi="맑은 고딕" w:cs="맑은 고딕"/>
               </w:rPr>
+              <w:lastRenderedPageBreak/>
               <w:t>BO-07</w:t>
             </w:r>
           </w:p>
@@ -22962,14 +22793,7 @@
               <w:rPr>
                 <w:rFonts w:ascii="맑은 고딕" w:eastAsia="맑은 고딕" w:hAnsi="맑은 고딕" w:cs="맑은 고딕" w:hint="eastAsia"/>
               </w:rPr>
-              <w:t xml:space="preserve">사용자가 입력한 프롬프트 내용 및 그에 따라 </w:t>
-            </w:r>
-            <w:r>
-              <w:rPr>
-                <w:rFonts w:ascii="맑은 고딕" w:eastAsia="맑은 고딕" w:hAnsi="맑은 고딕" w:cs="맑은 고딕" w:hint="eastAsia"/>
-              </w:rPr>
-              <w:lastRenderedPageBreak/>
-              <w:t>생성된 답변 내용을 기록하는 객체.</w:t>
+              <w:t>사용자가 입력한 프롬프트 내용 및 그에 따라 생성된 답변 내용을 기록하는 객체.</w:t>
             </w:r>
           </w:p>
         </w:tc>
@@ -23097,16 +22921,8 @@
               <w:rPr>
                 <w:rFonts w:ascii="맑은 고딕" w:eastAsia="맑은 고딕" w:hAnsi="맑은 고딕" w:cs="맑은 고딕"/>
               </w:rPr>
-              <w:t xml:space="preserve">비즈니스 </w:t>
-            </w:r>
-            <w:proofErr w:type="spellStart"/>
-            <w:r>
-              <w:rPr>
-                <w:rFonts w:ascii="맑은 고딕" w:eastAsia="맑은 고딕" w:hAnsi="맑은 고딕" w:cs="맑은 고딕"/>
-              </w:rPr>
-              <w:t>유스케이스</w:t>
-            </w:r>
-            <w:proofErr w:type="spellEnd"/>
+              <w:t>비즈니스 유스케이스</w:t>
+            </w:r>
           </w:p>
         </w:tc>
         <w:tc>
@@ -23130,21 +22946,7 @@
               <w:rPr>
                 <w:rFonts w:ascii="맑은 고딕" w:eastAsia="맑은 고딕" w:hAnsi="맑은 고딕" w:cs="맑은 고딕"/>
               </w:rPr>
-              <w:t xml:space="preserve">시스템과 </w:t>
-            </w:r>
-            <w:proofErr w:type="spellStart"/>
-            <w:r>
-              <w:rPr>
-                <w:rFonts w:ascii="맑은 고딕" w:eastAsia="맑은 고딕" w:hAnsi="맑은 고딕" w:cs="맑은 고딕"/>
-              </w:rPr>
-              <w:t>액터</w:t>
-            </w:r>
-            <w:proofErr w:type="spellEnd"/>
-            <w:r>
-              <w:rPr>
-                <w:rFonts w:ascii="맑은 고딕" w:eastAsia="맑은 고딕" w:hAnsi="맑은 고딕" w:cs="맑은 고딕"/>
-              </w:rPr>
-              <w:t>(사용자·관리자) 사이의 상호작용 단위로, 본 문서에서는 BUC-01~</w:t>
+              <w:t>시스템과 액터(사용자·관리자) 사이의 상호작용 단위로, 본 문서에서는 BUC-01~</w:t>
             </w:r>
             <w:r>
               <w:rPr>
@@ -23156,16 +22958,8 @@
               <w:rPr>
                 <w:rFonts w:ascii="맑은 고딕" w:eastAsia="맑은 고딕" w:hAnsi="맑은 고딕" w:cs="맑은 고딕"/>
               </w:rPr>
-              <w:t xml:space="preserve">로 </w:t>
-            </w:r>
-            <w:proofErr w:type="spellStart"/>
-            <w:r>
-              <w:rPr>
-                <w:rFonts w:ascii="맑은 고딕" w:eastAsia="맑은 고딕" w:hAnsi="맑은 고딕" w:cs="맑은 고딕"/>
-              </w:rPr>
-              <w:t>목록화됨</w:t>
-            </w:r>
-            <w:proofErr w:type="spellEnd"/>
+              <w:t>로 목록화됨</w:t>
+            </w:r>
           </w:p>
         </w:tc>
       </w:tr>
@@ -23217,35 +23011,7 @@
               <w:rPr>
                 <w:rFonts w:ascii="맑은 고딕" w:eastAsia="맑은 고딕" w:hAnsi="맑은 고딕" w:cs="맑은 고딕"/>
               </w:rPr>
-              <w:t xml:space="preserve">한 </w:t>
-            </w:r>
-            <w:proofErr w:type="spellStart"/>
-            <w:r>
-              <w:rPr>
-                <w:rFonts w:ascii="맑은 고딕" w:eastAsia="맑은 고딕" w:hAnsi="맑은 고딕" w:cs="맑은 고딕"/>
-              </w:rPr>
-              <w:t>유스케이스가</w:t>
-            </w:r>
-            <w:proofErr w:type="spellEnd"/>
-            <w:r>
-              <w:rPr>
-                <w:rFonts w:ascii="맑은 고딕" w:eastAsia="맑은 고딕" w:hAnsi="맑은 고딕" w:cs="맑은 고딕"/>
-              </w:rPr>
-              <w:t xml:space="preserve"> 다른 </w:t>
-            </w:r>
-            <w:proofErr w:type="spellStart"/>
-            <w:r>
-              <w:rPr>
-                <w:rFonts w:ascii="맑은 고딕" w:eastAsia="맑은 고딕" w:hAnsi="맑은 고딕" w:cs="맑은 고딕"/>
-              </w:rPr>
-              <w:t>유스케이스의</w:t>
-            </w:r>
-            <w:proofErr w:type="spellEnd"/>
-            <w:r>
-              <w:rPr>
-                <w:rFonts w:ascii="맑은 고딕" w:eastAsia="맑은 고딕" w:hAnsi="맑은 고딕" w:cs="맑은 고딕"/>
-              </w:rPr>
-              <w:t xml:space="preserve"> 공통 흐름을 항상 포함해 재사용하는 관계</w:t>
+              <w:t>한 유스케이스가 다른 유스케이스의 공통 흐름을 항상 포함해 재사용하는 관계</w:t>
             </w:r>
           </w:p>
         </w:tc>
@@ -23298,21 +23064,7 @@
               <w:rPr>
                 <w:rFonts w:ascii="맑은 고딕" w:eastAsia="맑은 고딕" w:hAnsi="맑은 고딕" w:cs="맑은 고딕"/>
               </w:rPr>
-              <w:t xml:space="preserve">특정 조건에서 선택적으로 다른 </w:t>
-            </w:r>
-            <w:proofErr w:type="spellStart"/>
-            <w:r>
-              <w:rPr>
-                <w:rFonts w:ascii="맑은 고딕" w:eastAsia="맑은 고딕" w:hAnsi="맑은 고딕" w:cs="맑은 고딕"/>
-              </w:rPr>
-              <w:t>유스케이스의</w:t>
-            </w:r>
-            <w:proofErr w:type="spellEnd"/>
-            <w:r>
-              <w:rPr>
-                <w:rFonts w:ascii="맑은 고딕" w:eastAsia="맑은 고딕" w:hAnsi="맑은 고딕" w:cs="맑은 고딕"/>
-              </w:rPr>
-              <w:t xml:space="preserve"> 흐름을 확장하는 관계</w:t>
+              <w:t>특정 조건에서 선택적으로 다른 유스케이스의 흐름을 확장하는 관계</w:t>
             </w:r>
           </w:p>
         </w:tc>
@@ -23336,19 +23088,11 @@
                 <w:rFonts w:ascii="맑은 고딕" w:eastAsia="맑은 고딕" w:hAnsi="맑은 고딕" w:cs="맑은 고딕"/>
               </w:rPr>
             </w:pPr>
-            <w:proofErr w:type="spellStart"/>
-            <w:r>
-              <w:rPr>
-                <w:rFonts w:ascii="맑은 고딕" w:eastAsia="맑은 고딕" w:hAnsi="맑은 고딕" w:cs="맑은 고딕"/>
-              </w:rPr>
-              <w:t>액터</w:t>
-            </w:r>
-            <w:proofErr w:type="spellEnd"/>
-            <w:r>
-              <w:rPr>
-                <w:rFonts w:ascii="맑은 고딕" w:eastAsia="맑은 고딕" w:hAnsi="맑은 고딕" w:cs="맑은 고딕"/>
-              </w:rPr>
-              <w:t>(사용자)</w:t>
+            <w:r>
+              <w:rPr>
+                <w:rFonts w:ascii="맑은 고딕" w:eastAsia="맑은 고딕" w:hAnsi="맑은 고딕" w:cs="맑은 고딕"/>
+              </w:rPr>
+              <w:t>액터(사용자)</w:t>
             </w:r>
           </w:p>
         </w:tc>
@@ -23400,19 +23144,11 @@
                 <w:rFonts w:ascii="맑은 고딕" w:eastAsia="맑은 고딕" w:hAnsi="맑은 고딕" w:cs="맑은 고딕"/>
               </w:rPr>
             </w:pPr>
-            <w:proofErr w:type="spellStart"/>
-            <w:r>
-              <w:rPr>
-                <w:rFonts w:ascii="맑은 고딕" w:eastAsia="맑은 고딕" w:hAnsi="맑은 고딕" w:cs="맑은 고딕"/>
-              </w:rPr>
-              <w:t>액터</w:t>
-            </w:r>
-            <w:proofErr w:type="spellEnd"/>
-            <w:r>
-              <w:rPr>
-                <w:rFonts w:ascii="맑은 고딕" w:eastAsia="맑은 고딕" w:hAnsi="맑은 고딕" w:cs="맑은 고딕"/>
-              </w:rPr>
-              <w:t>(관리자)</w:t>
+            <w:r>
+              <w:rPr>
+                <w:rFonts w:ascii="맑은 고딕" w:eastAsia="맑은 고딕" w:hAnsi="맑은 고딕" w:cs="맑은 고딕"/>
+              </w:rPr>
+              <w:t>액터(관리자)</w:t>
             </w:r>
           </w:p>
         </w:tc>
@@ -23691,25 +23427,7 @@
                               <w:color w:val="000000"/>
                               <w:sz w:val="18"/>
                             </w:rPr>
-                            <w:t xml:space="preserve">Copyright © 2025 </w:t>
-                          </w:r>
-                          <w:proofErr w:type="spellStart"/>
-                          <w:r>
-                            <w:rPr>
-                              <w:rFonts w:eastAsia="돋움"/>
-                              <w:color w:val="000000"/>
-                              <w:sz w:val="18"/>
-                            </w:rPr>
-                            <w:t>Dorororu</w:t>
-                          </w:r>
-                          <w:proofErr w:type="spellEnd"/>
-                          <w:r>
-                            <w:rPr>
-                              <w:rFonts w:eastAsia="돋움"/>
-                              <w:color w:val="000000"/>
-                              <w:sz w:val="18"/>
-                            </w:rPr>
-                            <w:t xml:space="preserve"> Company. All rights reserved.</w:t>
+                            <w:t>Copyright © 2025 Dorororu Company. All rights reserved.</w:t>
                           </w:r>
                         </w:p>
                       </w:txbxContent>

</xml_diff>